<commit_message>
Update ACC form, in particular to align with new checklist.
</commit_message>
<xml_diff>
--- a/assets/acc_form.docx
+++ b/assets/acc_form.docx
@@ -1,6 +1,6 @@
 
 <file path=word/document.xml><?xml version="1.0" encoding="utf-8"?>
-<w:document xmlns:wpc="http://schemas.microsoft.com/office/word/2010/wordprocessingCanvas" xmlns:cx="http://schemas.microsoft.com/office/drawing/2014/chartex" xmlns:cx1="http://schemas.microsoft.com/office/drawing/2015/9/8/chartex" xmlns:cx2="http://schemas.microsoft.com/office/drawing/2015/10/21/chartex" xmlns:cx3="http://schemas.microsoft.com/office/drawing/2016/5/9/chartex" xmlns:cx4="http://schemas.microsoft.com/office/drawing/2016/5/10/chartex" xmlns:cx5="http://schemas.microsoft.com/office/drawing/2016/5/11/chartex" xmlns:cx6="http://schemas.microsoft.com/office/drawing/2016/5/12/chartex" xmlns:cx7="http://schemas.microsoft.com/office/drawing/2016/5/13/chartex" xmlns:cx8="http://schemas.microsoft.com/office/drawing/2016/5/14/chartex" xmlns:mc="http://schemas.openxmlformats.org/markup-compatibility/2006" xmlns:aink="http://schemas.microsoft.com/office/drawing/2016/ink" xmlns:am3d="http://schemas.microsoft.com/office/drawing/2017/model3d" xmlns:o="urn:schemas-microsoft-com:office:office" xmlns:oel="http://schemas.microsoft.com/office/2019/extlst" xmlns:r="http://schemas.openxmlformats.org/officeDocument/2006/relationships" xmlns:m="http://schemas.openxmlformats.org/officeDocument/2006/math" xmlns:v="urn:schemas-microsoft-com:vml" xmlns:wp14="http://schemas.microsoft.com/office/word/2010/wordprocessingDrawing" xmlns:wp="http://schemas.openxmlformats.org/drawingml/2006/wordprocessingDrawing" xmlns:w10="urn:schemas-microsoft-com:office:word" xmlns:w="http://schemas.openxmlformats.org/wordprocessingml/2006/main" xmlns:w14="http://schemas.microsoft.com/office/word/2010/wordml" xmlns:w15="http://schemas.microsoft.com/office/word/2012/wordml" xmlns:w16cex="http://schemas.microsoft.com/office/word/2018/wordml/cex" xmlns:w16cid="http://schemas.microsoft.com/office/word/2016/wordml/cid" xmlns:w16="http://schemas.microsoft.com/office/word/2018/wordml" xmlns:w16sdtdh="http://schemas.microsoft.com/office/word/2020/wordml/sdtdatahash" xmlns:w16se="http://schemas.microsoft.com/office/word/2015/wordml/symex" xmlns:wpg="http://schemas.microsoft.com/office/word/2010/wordprocessingGroup" xmlns:wpi="http://schemas.microsoft.com/office/word/2010/wordprocessingInk" xmlns:wne="http://schemas.microsoft.com/office/word/2006/wordml" xmlns:wps="http://schemas.microsoft.com/office/word/2010/wordprocessingShape" mc:Ignorable="w14 w15 w16se w16cid w16 w16cex w16sdtdh wp14">
+<w:document xmlns:wpc="http://schemas.microsoft.com/office/word/2010/wordprocessingCanvas" xmlns:cx="http://schemas.microsoft.com/office/drawing/2014/chartex" xmlns:cx1="http://schemas.microsoft.com/office/drawing/2015/9/8/chartex" xmlns:cx2="http://schemas.microsoft.com/office/drawing/2015/10/21/chartex" xmlns:cx3="http://schemas.microsoft.com/office/drawing/2016/5/9/chartex" xmlns:cx4="http://schemas.microsoft.com/office/drawing/2016/5/10/chartex" xmlns:cx5="http://schemas.microsoft.com/office/drawing/2016/5/11/chartex" xmlns:cx6="http://schemas.microsoft.com/office/drawing/2016/5/12/chartex" xmlns:cx7="http://schemas.microsoft.com/office/drawing/2016/5/13/chartex" xmlns:cx8="http://schemas.microsoft.com/office/drawing/2016/5/14/chartex" xmlns:mc="http://schemas.openxmlformats.org/markup-compatibility/2006" xmlns:aink="http://schemas.microsoft.com/office/drawing/2016/ink" xmlns:am3d="http://schemas.microsoft.com/office/drawing/2017/model3d" xmlns:o="urn:schemas-microsoft-com:office:office" xmlns:oel="http://schemas.microsoft.com/office/2019/extlst" xmlns:r="http://schemas.openxmlformats.org/officeDocument/2006/relationships" xmlns:m="http://schemas.openxmlformats.org/officeDocument/2006/math" xmlns:v="urn:schemas-microsoft-com:vml" xmlns:wp14="http://schemas.microsoft.com/office/word/2010/wordprocessingDrawing" xmlns:wp="http://schemas.openxmlformats.org/drawingml/2006/wordprocessingDrawing" xmlns:w10="urn:schemas-microsoft-com:office:word" xmlns:w="http://schemas.openxmlformats.org/wordprocessingml/2006/main" xmlns:w14="http://schemas.microsoft.com/office/word/2010/wordml" xmlns:w15="http://schemas.microsoft.com/office/word/2012/wordml" xmlns:w16cex="http://schemas.microsoft.com/office/word/2018/wordml/cex" xmlns:w16cid="http://schemas.microsoft.com/office/word/2016/wordml/cid" xmlns:w16="http://schemas.microsoft.com/office/word/2018/wordml" xmlns:w16du="http://schemas.microsoft.com/office/word/2023/wordml/word16du" xmlns:w16sdtdh="http://schemas.microsoft.com/office/word/2020/wordml/sdtdatahash" xmlns:w16sdtfl="http://schemas.microsoft.com/office/word/2024/wordml/sdtformatlock" xmlns:w16se="http://schemas.microsoft.com/office/word/2015/wordml/symex" xmlns:wpg="http://schemas.microsoft.com/office/word/2010/wordprocessingGroup" xmlns:wpi="http://schemas.microsoft.com/office/word/2010/wordprocessingInk" xmlns:wne="http://schemas.microsoft.com/office/word/2006/wordml" xmlns:wps="http://schemas.microsoft.com/office/word/2010/wordprocessingShape" mc:Ignorable="w14 w15 w16se w16cid w16 w16cex w16sdtdh w16sdtfl w16du wp14">
   <w:body>
     <w:p>
       <w:pPr>
@@ -100,6 +100,8 @@
       <w:r>
         <w:rPr>
           <w:rStyle w:val="CommentReference"/>
+          <w:sz w:val="22"/>
+          <w:szCs w:val="22"/>
         </w:rPr>
         <w:commentReference w:id="2"/>
       </w:r>
@@ -145,6 +147,8 @@
       <w:r>
         <w:rPr>
           <w:rStyle w:val="CommentReference"/>
+          <w:sz w:val="32"/>
+          <w:szCs w:val="32"/>
         </w:rPr>
         <w:commentReference w:id="4"/>
       </w:r>
@@ -496,6 +500,8 @@
       <w:r>
         <w:rPr>
           <w:rStyle w:val="CommentReference"/>
+          <w:sz w:val="22"/>
+          <w:szCs w:val="22"/>
         </w:rPr>
         <w:commentReference w:id="7"/>
       </w:r>
@@ -584,7 +590,7 @@
         </w:sdtContent>
       </w:sdt>
       <w:r>
-        <w:t xml:space="preserve"> Data are or will be made available through some other mechanism, described here:</w:t>
+        <w:t xml:space="preserve"> Data are available through some other mechanism, described here:</w:t>
       </w:r>
     </w:p>
     <w:sdt>
@@ -646,7 +652,8 @@
       <w:r>
         <w:rPr>
           <w:rStyle w:val="CommentReference"/>
-          <w:color w:val="auto"/>
+          <w:sz w:val="28"/>
+          <w:szCs w:val="28"/>
         </w:rPr>
         <w:commentReference w:id="9"/>
       </w:r>
@@ -660,6 +667,8 @@
       <w:r>
         <w:rPr>
           <w:rStyle w:val="CommentReference"/>
+          <w:sz w:val="22"/>
+          <w:szCs w:val="22"/>
         </w:rPr>
         <w:commentReference w:id="10"/>
       </w:r>
@@ -760,7 +769,8 @@
       <w:r>
         <w:rPr>
           <w:rStyle w:val="CommentReference"/>
-          <w:color w:val="auto"/>
+          <w:sz w:val="28"/>
+          <w:szCs w:val="28"/>
         </w:rPr>
         <w:commentReference w:id="13"/>
       </w:r>
@@ -1095,7 +1105,8 @@
       <w:r>
         <w:rPr>
           <w:rStyle w:val="CommentReference"/>
-          <w:color w:val="auto"/>
+          <w:sz w:val="28"/>
+          <w:szCs w:val="28"/>
         </w:rPr>
         <w:commentReference w:id="15"/>
       </w:r>
@@ -1207,7 +1218,13 @@
         </w:sdtContent>
       </w:sdt>
       <w:r>
-        <w:t xml:space="preserve"> Data file(s) is (are) self-describiing (e.g., netCDF files) </w:t>
+        <w:t xml:space="preserve"> Data file(s) is (are) self-describiing (e.g., netCDF</w:t>
+      </w:r>
+      <w:r>
+        <w:t>, HDF5, Zarr</w:t>
+      </w:r>
+      <w:r>
+        <w:t xml:space="preserve"> files) </w:t>
       </w:r>
     </w:p>
     <w:p>
@@ -1299,7 +1316,8 @@
       <w:r>
         <w:rPr>
           <w:rStyle w:val="CommentReference"/>
-          <w:color w:val="auto"/>
+          <w:sz w:val="28"/>
+          <w:szCs w:val="28"/>
         </w:rPr>
         <w:commentReference w:id="16"/>
       </w:r>
@@ -1379,6 +1397,8 @@
       <w:r>
         <w:rPr>
           <w:rStyle w:val="CommentReference"/>
+          <w:sz w:val="32"/>
+          <w:szCs w:val="32"/>
         </w:rPr>
         <w:commentReference w:id="17"/>
       </w:r>
@@ -1480,7 +1500,8 @@
       <w:r>
         <w:rPr>
           <w:rStyle w:val="CommentReference"/>
-          <w:color w:val="auto"/>
+          <w:sz w:val="28"/>
+          <w:szCs w:val="28"/>
         </w:rPr>
         <w:commentReference w:id="19"/>
       </w:r>
@@ -1585,7 +1606,40 @@
         </w:sdtContent>
       </w:sdt>
       <w:r>
-        <w:t xml:space="preserve"> Python     </w:t>
+        <w:t xml:space="preserve"> Python </w:t>
+      </w:r>
+      <w:r>
+        <w:rPr>
+          <w:rFonts w:ascii="MS Gothic" w:eastAsia="MS Gothic" w:hAnsi="MS Gothic" w:cs="MS Gothic"/>
+        </w:rPr>
+        <w:t xml:space="preserve">  </w:t>
+      </w:r>
+      <w:sdt>
+        <w:sdtPr>
+          <w:rPr>
+            <w:rFonts w:ascii="MS Gothic" w:eastAsia="MS Gothic" w:hAnsi="MS Gothic" w:cs="MS Gothic"/>
+          </w:rPr>
+          <w:id w:val="398876558"/>
+          <w14:checkbox>
+            <w14:checked w14:val="0"/>
+            <w14:checkedState w14:val="2612" w14:font="MS Gothic"/>
+            <w14:uncheckedState w14:val="2610" w14:font="MS Gothic"/>
+          </w14:checkbox>
+        </w:sdtPr>
+        <w:sdtContent>
+          <w:r>
+            <w:rPr>
+              <w:rFonts w:ascii="MS Gothic" w:eastAsia="MS Gothic" w:hAnsi="MS Gothic" w:cs="MS Gothic" w:hint="eastAsia"/>
+            </w:rPr>
+            <w:t>☐</w:t>
+          </w:r>
+        </w:sdtContent>
+      </w:sdt>
+      <w:r>
+        <w:t xml:space="preserve"> Julia  </w:t>
+      </w:r>
+      <w:r>
+        <w:t xml:space="preserve">   </w:t>
       </w:r>
       <w:sdt>
         <w:sdtPr>
@@ -1609,7 +1663,10 @@
         </w:sdtContent>
       </w:sdt>
       <w:r>
-        <w:t xml:space="preserve"> Matlab</w:t>
+        <w:t xml:space="preserve"> M</w:t>
+      </w:r>
+      <w:r>
+        <w:t>ATLAB</w:t>
       </w:r>
     </w:p>
     <w:p>
@@ -1778,7 +1835,43 @@
         </w:sdtContent>
       </w:sdt>
       <w:r>
-        <w:t xml:space="preserve"> Python    </w:t>
+        <w:t xml:space="preserve"> Python</w:t>
+      </w:r>
+      <w:r>
+        <w:t xml:space="preserve"> </w:t>
+      </w:r>
+      <w:r>
+        <w:rPr>
+          <w:rFonts w:ascii="MS Gothic" w:eastAsia="MS Gothic" w:hAnsi="MS Gothic" w:cs="MS Gothic"/>
+        </w:rPr>
+        <w:t xml:space="preserve">  </w:t>
+      </w:r>
+      <w:sdt>
+        <w:sdtPr>
+          <w:rPr>
+            <w:rFonts w:ascii="MS Gothic" w:eastAsia="MS Gothic" w:hAnsi="MS Gothic" w:cs="MS Gothic"/>
+          </w:rPr>
+          <w:id w:val="-902749970"/>
+          <w14:checkbox>
+            <w14:checked w14:val="0"/>
+            <w14:checkedState w14:val="2612" w14:font="MS Gothic"/>
+            <w14:uncheckedState w14:val="2610" w14:font="MS Gothic"/>
+          </w14:checkbox>
+        </w:sdtPr>
+        <w:sdtContent>
+          <w:r>
+            <w:rPr>
+              <w:rFonts w:ascii="MS Gothic" w:eastAsia="MS Gothic" w:hAnsi="MS Gothic" w:cs="MS Gothic" w:hint="eastAsia"/>
+            </w:rPr>
+            <w:t>☐</w:t>
+          </w:r>
+        </w:sdtContent>
+      </w:sdt>
+      <w:r>
+        <w:t xml:space="preserve"> Julia</w:t>
+      </w:r>
+      <w:r>
+        <w:t xml:space="preserve">    </w:t>
       </w:r>
       <w:sdt>
         <w:sdtPr>
@@ -1956,7 +2049,13 @@
         </w:sdtContent>
       </w:sdt>
       <w:r>
-        <w:t xml:space="preserve"> R Markdown    </w:t>
+        <w:t xml:space="preserve"> </w:t>
+      </w:r>
+      <w:r>
+        <w:t xml:space="preserve">Quarto or </w:t>
+      </w:r>
+      <w:r>
+        <w:t xml:space="preserve">R Markdown    </w:t>
       </w:r>
       <w:sdt>
         <w:sdtPr>
@@ -2224,7 +2323,8 @@
       <w:r>
         <w:rPr>
           <w:rStyle w:val="CommentReference"/>
-          <w:color w:val="auto"/>
+          <w:sz w:val="28"/>
+          <w:szCs w:val="28"/>
         </w:rPr>
         <w:commentReference w:id="21"/>
       </w:r>
@@ -2251,6 +2351,8 @@
       <w:r>
         <w:rPr>
           <w:rStyle w:val="CommentReference"/>
+          <w:sz w:val="22"/>
+          <w:szCs w:val="22"/>
         </w:rPr>
         <w:commentReference w:id="22"/>
       </w:r>
@@ -2318,6 +2420,8 @@
       <w:r>
         <w:rPr>
           <w:rStyle w:val="CommentReference"/>
+          <w:sz w:val="22"/>
+          <w:szCs w:val="22"/>
         </w:rPr>
         <w:commentReference w:id="23"/>
       </w:r>
@@ -2396,7 +2500,8 @@
       <w:r>
         <w:rPr>
           <w:rStyle w:val="CommentReference"/>
-          <w:color w:val="auto"/>
+          <w:sz w:val="28"/>
+          <w:szCs w:val="28"/>
         </w:rPr>
         <w:commentReference w:id="24"/>
       </w:r>
@@ -2450,8 +2555,18 @@
       <w:pPr>
         <w:pStyle w:val="Heading3"/>
       </w:pPr>
+      <w:commentRangeStart w:id="25"/>
       <w:r>
         <w:t>Parallelization used</w:t>
+      </w:r>
+      <w:commentRangeEnd w:id="25"/>
+      <w:r>
+        <w:rPr>
+          <w:rStyle w:val="CommentReference"/>
+          <w:sz w:val="28"/>
+          <w:szCs w:val="28"/>
+        </w:rPr>
+        <w:commentReference w:id="25"/>
       </w:r>
     </w:p>
     <w:p>
@@ -2520,7 +2635,7 @@
           </w:ffData>
         </w:fldChar>
       </w:r>
-      <w:bookmarkStart w:id="25" w:name="Text1"/>
+      <w:bookmarkStart w:id="26" w:name="Text1"/>
       <w:r>
         <w:instrText xml:space="preserve"> FORMTEXT </w:instrText>
       </w:r>
@@ -2560,7 +2675,7 @@
       <w:r>
         <w:fldChar w:fldCharType="end"/>
       </w:r>
-      <w:bookmarkEnd w:id="25"/>
+      <w:bookmarkEnd w:id="26"/>
     </w:p>
     <w:p>
       <w:sdt>
@@ -2646,8 +2761,8 @@
       <w:pPr>
         <w:pStyle w:val="Heading3"/>
       </w:pPr>
-      <w:bookmarkStart w:id="26" w:name="_heading=h.z337ya" w:colFirst="0" w:colLast="0"/>
-      <w:bookmarkEnd w:id="26"/>
+      <w:bookmarkStart w:id="27" w:name="_heading=h.z337ya" w:colFirst="0" w:colLast="0"/>
+      <w:bookmarkEnd w:id="27"/>
       <w:r>
         <w:t>License</w:t>
       </w:r>
@@ -2855,17 +2970,18 @@
       <w:pPr>
         <w:pStyle w:val="Heading3"/>
       </w:pPr>
-      <w:commentRangeStart w:id="27"/>
+      <w:commentRangeStart w:id="28"/>
       <w:r>
         <w:t>Additional information</w:t>
       </w:r>
-      <w:commentRangeEnd w:id="27"/>
+      <w:commentRangeEnd w:id="28"/>
       <w:r>
         <w:rPr>
           <w:rStyle w:val="CommentReference"/>
-          <w:color w:val="auto"/>
-        </w:rPr>
-        <w:commentReference w:id="27"/>
+          <w:sz w:val="28"/>
+          <w:szCs w:val="28"/>
+        </w:rPr>
+        <w:commentReference w:id="28"/>
       </w:r>
       <w:r>
         <w:t xml:space="preserve"> (optional)</w:t>
@@ -2937,27 +3053,29 @@
         <w:lastRenderedPageBreak/>
         <w:t xml:space="preserve">Part 3: </w:t>
       </w:r>
-      <w:commentRangeStart w:id="28"/>
+      <w:commentRangeStart w:id="29"/>
       <w:r>
         <w:t>Reproducibility w</w:t>
       </w:r>
       <w:r>
         <w:t>orkflow</w:t>
       </w:r>
-      <w:commentRangeEnd w:id="28"/>
+      <w:commentRangeEnd w:id="29"/>
       <w:r>
         <w:rPr>
           <w:rStyle w:val="CommentReference"/>
-        </w:rPr>
-        <w:commentReference w:id="28"/>
+          <w:sz w:val="40"/>
+          <w:szCs w:val="40"/>
+        </w:rPr>
+        <w:commentReference w:id="29"/>
       </w:r>
     </w:p>
     <w:p>
       <w:pPr>
         <w:pStyle w:val="Heading2"/>
       </w:pPr>
-      <w:bookmarkStart w:id="29" w:name="_heading=h.4i7ojhp" w:colFirst="0" w:colLast="0"/>
-      <w:bookmarkEnd w:id="29"/>
+      <w:bookmarkStart w:id="30" w:name="_heading=h.4i7ojhp" w:colFirst="0" w:colLast="0"/>
+      <w:bookmarkEnd w:id="30"/>
       <w:r>
         <w:t>Scope</w:t>
       </w:r>
@@ -3132,8 +3250,8 @@
       <w:pPr>
         <w:pStyle w:val="Heading2"/>
       </w:pPr>
-      <w:bookmarkStart w:id="30" w:name="_heading=h.1ci93xb" w:colFirst="0" w:colLast="0"/>
-      <w:bookmarkEnd w:id="30"/>
+      <w:bookmarkStart w:id="31" w:name="_heading=h.1ci93xb" w:colFirst="0" w:colLast="0"/>
+      <w:bookmarkEnd w:id="31"/>
       <w:r>
         <w:t>Workflow details</w:t>
       </w:r>
@@ -3142,17 +3260,18 @@
       <w:pPr>
         <w:pStyle w:val="Heading3"/>
       </w:pPr>
-      <w:commentRangeStart w:id="31"/>
+      <w:commentRangeStart w:id="32"/>
       <w:r>
         <w:t>Location</w:t>
       </w:r>
-      <w:commentRangeEnd w:id="31"/>
+      <w:commentRangeEnd w:id="32"/>
       <w:r>
         <w:rPr>
           <w:rStyle w:val="CommentReference"/>
-          <w:color w:val="auto"/>
-        </w:rPr>
-        <w:commentReference w:id="31"/>
+          <w:sz w:val="28"/>
+          <w:szCs w:val="28"/>
+        </w:rPr>
+        <w:commentReference w:id="32"/>
       </w:r>
       <w:r>
         <w:t xml:space="preserve"> </w:t>
@@ -3344,17 +3463,18 @@
       <w:pPr>
         <w:pStyle w:val="Heading3"/>
       </w:pPr>
-      <w:commentRangeStart w:id="32"/>
+      <w:commentRangeStart w:id="33"/>
       <w:r>
         <w:t>Format(s)</w:t>
       </w:r>
-      <w:commentRangeEnd w:id="32"/>
+      <w:commentRangeEnd w:id="33"/>
       <w:r>
         <w:rPr>
           <w:rStyle w:val="CommentReference"/>
-          <w:color w:val="auto"/>
-        </w:rPr>
-        <w:commentReference w:id="32"/>
+          <w:sz w:val="28"/>
+          <w:szCs w:val="28"/>
+        </w:rPr>
+        <w:commentReference w:id="33"/>
       </w:r>
       <w:r>
         <w:t xml:space="preserve"> </w:t>
@@ -3435,7 +3555,13 @@
         </w:sdtContent>
       </w:sdt>
       <w:r>
-        <w:t xml:space="preserve"> Self-contained R Markdown file, Jupyter notebook, or other literate programming approach</w:t>
+        <w:t xml:space="preserve"> Self-contained </w:t>
+      </w:r>
+      <w:r>
+        <w:t xml:space="preserve">Quarto, </w:t>
+      </w:r>
+      <w:r>
+        <w:t>R Markdown file, Jupyter notebook, or other literate programming approach</w:t>
       </w:r>
     </w:p>
     <w:p>
@@ -3526,19 +3652,20 @@
       <w:pPr>
         <w:pStyle w:val="Heading3"/>
       </w:pPr>
-      <w:bookmarkStart w:id="33" w:name="_heading=h.3whwml4" w:colFirst="0" w:colLast="0"/>
-      <w:bookmarkEnd w:id="33"/>
-      <w:commentRangeStart w:id="34"/>
+      <w:bookmarkStart w:id="34" w:name="_heading=h.3whwml4" w:colFirst="0" w:colLast="0"/>
+      <w:bookmarkEnd w:id="34"/>
+      <w:commentRangeStart w:id="35"/>
       <w:r>
         <w:t>Instructions</w:t>
       </w:r>
-      <w:commentRangeEnd w:id="34"/>
+      <w:commentRangeEnd w:id="35"/>
       <w:r>
         <w:rPr>
           <w:rStyle w:val="CommentReference"/>
-          <w:color w:val="auto"/>
-        </w:rPr>
-        <w:commentReference w:id="34"/>
+          <w:sz w:val="28"/>
+          <w:szCs w:val="28"/>
+        </w:rPr>
+        <w:commentReference w:id="35"/>
       </w:r>
     </w:p>
     <w:sdt>
@@ -3619,26 +3746,21 @@
     <w:p/>
     <w:p>
       <w:pPr>
-        <w:rPr>
+        <w:pStyle w:val="Heading3"/>
+      </w:pPr>
+      <w:commentRangeStart w:id="36"/>
+      <w:r>
+        <w:t>Expected run-time</w:t>
+      </w:r>
+      <w:commentRangeEnd w:id="36"/>
+      <w:r>
+        <w:rPr>
+          <w:rStyle w:val="CommentReference"/>
           <w:sz w:val="28"/>
           <w:szCs w:val="28"/>
         </w:rPr>
-      </w:pPr>
-      <w:r>
-        <w:rPr>
-          <w:sz w:val="28"/>
-          <w:szCs w:val="28"/>
-        </w:rPr>
-        <w:t>Expected run-time</w:t>
-      </w:r>
-    </w:p>
-    <w:p>
-      <w:pPr>
-        <w:rPr>
-          <w:sz w:val="28"/>
-          <w:szCs w:val="28"/>
-        </w:rPr>
-      </w:pPr>
+        <w:commentReference w:id="36"/>
+      </w:r>
     </w:p>
     <w:p>
       <w:r>
@@ -3861,17 +3983,18 @@
       <w:pPr>
         <w:pStyle w:val="Heading3"/>
       </w:pPr>
-      <w:commentRangeStart w:id="35"/>
+      <w:commentRangeStart w:id="37"/>
       <w:r>
         <w:t>Additional documentation (optional)</w:t>
       </w:r>
-      <w:commentRangeEnd w:id="35"/>
+      <w:commentRangeEnd w:id="37"/>
       <w:r>
         <w:rPr>
           <w:rStyle w:val="CommentReference"/>
-          <w:color w:val="auto"/>
-        </w:rPr>
-        <w:commentReference w:id="35"/>
+          <w:sz w:val="28"/>
+          <w:szCs w:val="28"/>
+        </w:rPr>
+        <w:commentReference w:id="37"/>
       </w:r>
     </w:p>
     <w:sdt>
@@ -3953,18 +4076,20 @@
       <w:pPr>
         <w:pStyle w:val="Heading1"/>
       </w:pPr>
-      <w:bookmarkStart w:id="36" w:name="_heading=h.3as4poj" w:colFirst="0" w:colLast="0"/>
-      <w:bookmarkEnd w:id="36"/>
-      <w:commentRangeStart w:id="37"/>
+      <w:bookmarkStart w:id="38" w:name="_heading=h.3as4poj" w:colFirst="0" w:colLast="0"/>
+      <w:bookmarkEnd w:id="38"/>
+      <w:commentRangeStart w:id="39"/>
       <w:r>
         <w:t>Notes</w:t>
       </w:r>
-      <w:commentRangeEnd w:id="37"/>
+      <w:commentRangeEnd w:id="39"/>
       <w:r>
         <w:rPr>
           <w:rStyle w:val="CommentReference"/>
-        </w:rPr>
-        <w:commentReference w:id="37"/>
+          <w:sz w:val="40"/>
+          <w:szCs w:val="40"/>
+        </w:rPr>
+        <w:commentReference w:id="39"/>
       </w:r>
       <w:r>
         <w:t xml:space="preserve"> (optional)</w:t>
@@ -4047,12 +4172,8 @@
     <w:p/>
     <w:p/>
     <w:sectPr>
-      <w:headerReference w:type="even" r:id="rId11"/>
-      <w:headerReference w:type="default" r:id="rId12"/>
-      <w:footerReference w:type="even" r:id="rId13"/>
-      <w:footerReference w:type="default" r:id="rId14"/>
-      <w:headerReference w:type="first" r:id="rId15"/>
-      <w:footerReference w:type="first" r:id="rId16"/>
+      <w:headerReference w:type="default" r:id="rId11"/>
+      <w:footerReference w:type="default" r:id="rId12"/>
       <w:pgSz w:w="12240" w:h="15840"/>
       <w:pgMar w:top="1440" w:right="1440" w:bottom="1440" w:left="1440" w:header="576" w:footer="720" w:gutter="0"/>
       <w:cols w:space="720"/>
@@ -4063,12 +4184,9 @@
 </file>
 
 <file path=word/comments.xml><?xml version="1.0" encoding="utf-8"?>
-<w:comments xmlns:wpc="http://schemas.microsoft.com/office/word/2010/wordprocessingCanvas" xmlns:cx="http://schemas.microsoft.com/office/drawing/2014/chartex" xmlns:cx1="http://schemas.microsoft.com/office/drawing/2015/9/8/chartex" xmlns:cx2="http://schemas.microsoft.com/office/drawing/2015/10/21/chartex" xmlns:cx3="http://schemas.microsoft.com/office/drawing/2016/5/9/chartex" xmlns:cx4="http://schemas.microsoft.com/office/drawing/2016/5/10/chartex" xmlns:cx5="http://schemas.microsoft.com/office/drawing/2016/5/11/chartex" xmlns:cx6="http://schemas.microsoft.com/office/drawing/2016/5/12/chartex" xmlns:cx7="http://schemas.microsoft.com/office/drawing/2016/5/13/chartex" xmlns:cx8="http://schemas.microsoft.com/office/drawing/2016/5/14/chartex" xmlns:mc="http://schemas.openxmlformats.org/markup-compatibility/2006" xmlns:aink="http://schemas.microsoft.com/office/drawing/2016/ink" xmlns:am3d="http://schemas.microsoft.com/office/drawing/2017/model3d" xmlns:o="urn:schemas-microsoft-com:office:office" xmlns:oel="http://schemas.microsoft.com/office/2019/extlst" xmlns:r="http://schemas.openxmlformats.org/officeDocument/2006/relationships" xmlns:m="http://schemas.openxmlformats.org/officeDocument/2006/math" xmlns:v="urn:schemas-microsoft-com:vml" xmlns:wp14="http://schemas.microsoft.com/office/word/2010/wordprocessingDrawing" xmlns:wp="http://schemas.openxmlformats.org/drawingml/2006/wordprocessingDrawing" xmlns:w10="urn:schemas-microsoft-com:office:word" xmlns:w="http://schemas.openxmlformats.org/wordprocessingml/2006/main" xmlns:w14="http://schemas.microsoft.com/office/word/2010/wordml" xmlns:w15="http://schemas.microsoft.com/office/word/2012/wordml" xmlns:w16cex="http://schemas.microsoft.com/office/word/2018/wordml/cex" xmlns:w16cid="http://schemas.microsoft.com/office/word/2016/wordml/cid" xmlns:w16="http://schemas.microsoft.com/office/word/2018/wordml" xmlns:w16sdtdh="http://schemas.microsoft.com/office/word/2020/wordml/sdtdatahash" xmlns:w16se="http://schemas.microsoft.com/office/word/2015/wordml/symex" xmlns:wpg="http://schemas.microsoft.com/office/word/2010/wordprocessingGroup" xmlns:wpi="http://schemas.microsoft.com/office/word/2010/wordprocessingInk" xmlns:wne="http://schemas.microsoft.com/office/word/2006/wordml" xmlns:wps="http://schemas.microsoft.com/office/word/2010/wordprocessingShape" mc:Ignorable="w14 w15 w16se w16cid w16 w16cex w16sdtdh wp14">
+<w:comments xmlns:wpc="http://schemas.microsoft.com/office/word/2010/wordprocessingCanvas" xmlns:cx="http://schemas.microsoft.com/office/drawing/2014/chartex" xmlns:cx1="http://schemas.microsoft.com/office/drawing/2015/9/8/chartex" xmlns:cx2="http://schemas.microsoft.com/office/drawing/2015/10/21/chartex" xmlns:cx3="http://schemas.microsoft.com/office/drawing/2016/5/9/chartex" xmlns:cx4="http://schemas.microsoft.com/office/drawing/2016/5/10/chartex" xmlns:cx5="http://schemas.microsoft.com/office/drawing/2016/5/11/chartex" xmlns:cx6="http://schemas.microsoft.com/office/drawing/2016/5/12/chartex" xmlns:cx7="http://schemas.microsoft.com/office/drawing/2016/5/13/chartex" xmlns:cx8="http://schemas.microsoft.com/office/drawing/2016/5/14/chartex" xmlns:mc="http://schemas.openxmlformats.org/markup-compatibility/2006" xmlns:aink="http://schemas.microsoft.com/office/drawing/2016/ink" xmlns:am3d="http://schemas.microsoft.com/office/drawing/2017/model3d" xmlns:o="urn:schemas-microsoft-com:office:office" xmlns:oel="http://schemas.microsoft.com/office/2019/extlst" xmlns:r="http://schemas.openxmlformats.org/officeDocument/2006/relationships" xmlns:m="http://schemas.openxmlformats.org/officeDocument/2006/math" xmlns:v="urn:schemas-microsoft-com:vml" xmlns:wp14="http://schemas.microsoft.com/office/word/2010/wordprocessingDrawing" xmlns:wp="http://schemas.openxmlformats.org/drawingml/2006/wordprocessingDrawing" xmlns:w10="urn:schemas-microsoft-com:office:word" xmlns:w="http://schemas.openxmlformats.org/wordprocessingml/2006/main" xmlns:w14="http://schemas.microsoft.com/office/word/2010/wordml" xmlns:w15="http://schemas.microsoft.com/office/word/2012/wordml" xmlns:w16cex="http://schemas.microsoft.com/office/word/2018/wordml/cex" xmlns:w16cid="http://schemas.microsoft.com/office/word/2016/wordml/cid" xmlns:w16="http://schemas.microsoft.com/office/word/2018/wordml" xmlns:w16du="http://schemas.microsoft.com/office/word/2023/wordml/word16du" xmlns:w16sdtdh="http://schemas.microsoft.com/office/word/2020/wordml/sdtdatahash" xmlns:w16sdtfl="http://schemas.microsoft.com/office/word/2024/wordml/sdtformatlock" xmlns:w16se="http://schemas.microsoft.com/office/word/2015/wordml/symex" xmlns:wpg="http://schemas.microsoft.com/office/word/2010/wordprocessingGroup" xmlns:wpi="http://schemas.microsoft.com/office/word/2010/wordprocessingInk" xmlns:wne="http://schemas.microsoft.com/office/word/2006/wordml" xmlns:wps="http://schemas.microsoft.com/office/word/2010/wordprocessingShape" mc:Ignorable="w14 w15 w16se w16cid w16 w16cex w16sdtdh w16sdtfl w16du wp14">
   <w:comment w:id="1" w:author="Author" w:initials="A">
     <w:p>
-      <w:pPr>
-        <w:pStyle w:val="CommentText"/>
-      </w:pPr>
       <w:r>
         <w:rPr>
           <w:rStyle w:val="CommentReference"/>
@@ -4077,42 +4195,154 @@
       </w:r>
       <w:r>
         <w:rPr>
-          <w:rFonts w:hint="eastAsia"/>
-        </w:rPr>
-        <w:t xml:space="preserve">This document will be read by readers after an accepted manuscript is published so please phrase your responses for future readers. </w:t>
-      </w:r>
-      <w:r>
-        <w:t xml:space="preserve">Please see </w:t>
+          <w:sz w:val="20"/>
+          <w:szCs w:val="20"/>
+        </w:rPr>
+        <w:t xml:space="preserve">This document will be read by readers after an accepted manuscript is published so please phrase your responses for future readers and make sure to save your completed form as a PDF without these comments. Please see </w:t>
       </w:r>
       <w:hyperlink r:id="rId1" w:history="1">
         <w:r>
           <w:rPr>
             <w:rStyle w:val="Hyperlink"/>
+            <w:sz w:val="20"/>
+            <w:szCs w:val="20"/>
           </w:rPr>
           <w:t>https://jasa-acs.github.io/repro-guide/pages/acc.html</w:t>
         </w:r>
       </w:hyperlink>
       <w:r>
-        <w:t xml:space="preserve"> for details</w:t>
-      </w:r>
-      <w:r>
-        <w:t>,</w:t>
-      </w:r>
-      <w:r>
-        <w:t xml:space="preserve"> links to examples</w:t>
-      </w:r>
-      <w:r>
-        <w:t>, and information on how to save your completed form as a PDF</w:t>
-      </w:r>
-      <w:r>
-        <w:t>.</w:t>
-      </w:r>
-      <w:r>
-        <w:t xml:space="preserve"> In particular make sure to remove these comments when saving as a PDF.</w:t>
+        <w:rPr>
+          <w:sz w:val="20"/>
+          <w:szCs w:val="20"/>
+        </w:rPr>
+        <w:t xml:space="preserve"> for details, links to examples, and information on how to save your completed form as a PDF. In particular make sure to remove these comments when saving as a PDF.</w:t>
       </w:r>
     </w:p>
   </w:comment>
   <w:comment w:id="2" w:author="Author" w:initials="A">
+    <w:p>
+      <w:r>
+        <w:rPr>
+          <w:rStyle w:val="CommentReference"/>
+        </w:rPr>
+        <w:annotationRef/>
+      </w:r>
+      <w:r>
+        <w:rPr>
+          <w:sz w:val="20"/>
+          <w:szCs w:val="20"/>
+        </w:rPr>
+        <w:t>If this box is checked and if no simulated/synthetic data files are provided by the authors, please skip directly to the Code section. Otherwise, continue.</w:t>
+      </w:r>
+    </w:p>
+  </w:comment>
+  <w:comment w:id="4" w:author="Author" w:initials="A">
+    <w:p>
+      <w:r>
+        <w:rPr>
+          <w:rStyle w:val="CommentReference"/>
+        </w:rPr>
+        <w:annotationRef/>
+      </w:r>
+      <w:r>
+        <w:rPr>
+          <w:sz w:val="20"/>
+          <w:szCs w:val="20"/>
+        </w:rPr>
+        <w:t>A short (&lt; 100 words) description of the data. Additional details can be provided in README file(s) accompanying the materials.</w:t>
+      </w:r>
+    </w:p>
+  </w:comment>
+  <w:comment w:id="7" w:author="Author" w:date="2020-04-26T20:58:00Z" w:initials="CP">
+    <w:p>
+      <w:r>
+        <w:rPr>
+          <w:rStyle w:val="CommentReference"/>
+        </w:rPr>
+        <w:annotationRef/>
+      </w:r>
+      <w:r>
+        <w:rPr>
+          <w:sz w:val="20"/>
+          <w:szCs w:val="20"/>
+        </w:rPr>
+        <w:t>If the data are available by request to the authors or some other data owner, please make sure to explain the process of requesting access to the data and the details of how to access the specific data files needed. Details are generally best provided in README file(s) accompanying the materials.</w:t>
+      </w:r>
+    </w:p>
+    <w:p/>
+  </w:comment>
+  <w:comment w:id="9" w:author="Author" w:initials="A">
+    <w:p>
+      <w:r>
+        <w:rPr>
+          <w:rStyle w:val="CommentReference"/>
+        </w:rPr>
+        <w:annotationRef/>
+      </w:r>
+      <w:r>
+        <w:rPr>
+          <w:sz w:val="20"/>
+          <w:szCs w:val="20"/>
+        </w:rPr>
+        <w:t>If the data for this manuscript are publicly available, skip to the Description section below. Otherwise, continue.</w:t>
+      </w:r>
+    </w:p>
+    <w:p/>
+    <w:p>
+      <w:r>
+        <w:rPr>
+          <w:sz w:val="20"/>
+          <w:szCs w:val="20"/>
+        </w:rPr>
+        <w:t>The Journal of the American Statistical Association requires authors to make data accompanying their papers available to the scientific community except in cases where: 1) public sharing of data would be impossible, 2) a synthetic/facsimile dataset in the same format as the real data is provided (recognizing that results may differ substantially from the real data analyses), and 3) the scientific value of the results and methods outweigh the lack of reproducibility.</w:t>
+      </w:r>
+    </w:p>
+  </w:comment>
+  <w:comment w:id="10" w:author="Author" w:initials="A">
+    <w:p>
+      <w:r>
+        <w:rPr>
+          <w:rStyle w:val="CommentReference"/>
+        </w:rPr>
+        <w:annotationRef/>
+      </w:r>
+      <w:r>
+        <w:rPr>
+          <w:sz w:val="20"/>
+          <w:szCs w:val="20"/>
+        </w:rPr>
+        <w:t>For example:</w:t>
+      </w:r>
+    </w:p>
+    <w:p>
+      <w:r>
+        <w:rPr>
+          <w:sz w:val="20"/>
+          <w:szCs w:val="20"/>
+        </w:rPr>
+        <w:t>- why data sharing is not possible,</w:t>
+      </w:r>
+    </w:p>
+    <w:p>
+      <w:r>
+        <w:rPr>
+          <w:sz w:val="20"/>
+          <w:szCs w:val="20"/>
+        </w:rPr>
+        <w:t xml:space="preserve">- what synthetic/facsimile data are provided, and </w:t>
+      </w:r>
+    </w:p>
+    <w:p>
+      <w:r>
+        <w:rPr>
+          <w:sz w:val="20"/>
+          <w:szCs w:val="20"/>
+        </w:rPr>
+        <w:t>- why the value of the paper's scientific contribution outweighs the lack of reproducibility.</w:t>
+      </w:r>
+    </w:p>
+  </w:comment>
+  <w:comment w:id="13" w:author="Author" w:date="2020-04-25T15:22:00Z" w:initials="CP">
     <w:p>
       <w:pPr>
         <w:pStyle w:val="CommentText"/>
@@ -4124,17 +4354,11 @@
         <w:annotationRef/>
       </w:r>
       <w:r>
-        <w:t xml:space="preserve">If </w:t>
-      </w:r>
-      <w:r>
-        <w:t xml:space="preserve">this </w:t>
-      </w:r>
-      <w:r>
-        <w:t>box is checked, please skip directly to the Code section. Otherwise, continue.</w:t>
+        <w:t>Check all that apply.</w:t>
       </w:r>
     </w:p>
   </w:comment>
-  <w:comment w:id="4" w:author="Author" w:initials="A">
+  <w:comment w:id="15" w:author="Author" w:date="2020-04-25T15:20:00Z" w:initials="CP">
     <w:p>
       <w:pPr>
         <w:pStyle w:val="CommentText"/>
@@ -4146,20 +4370,45 @@
         <w:annotationRef/>
       </w:r>
       <w:r>
-        <w:t>A short (</w:t>
-      </w:r>
-      <w:r>
-        <w:t xml:space="preserve">&lt; </w:t>
-      </w:r>
-      <w:r>
-        <w:t>100 words) description of the data</w:t>
-      </w:r>
-      <w:r>
-        <w:t>. More details can be provided in files accompanying the data.</w:t>
+        <w:t>A data dictionary provides information that allows users to understand the meaning, format, and use of the data.</w:t>
       </w:r>
     </w:p>
   </w:comment>
-  <w:comment w:id="7" w:author="Author" w:date="2020-04-26T20:58:00Z" w:initials="CP">
+  <w:comment w:id="16" w:author="Author" w:date="2020-04-25T15:36:00Z" w:initials="CP">
+    <w:p>
+      <w:r>
+        <w:rPr>
+          <w:rStyle w:val="CommentReference"/>
+        </w:rPr>
+        <w:annotationRef/>
+      </w:r>
+      <w:r>
+        <w:rPr>
+          <w:sz w:val="20"/>
+          <w:szCs w:val="20"/>
+        </w:rPr>
+        <w:t>Provide any details that would be helpful in understanding the data. If relevant, provide unique identifier/DOI/version information and/or license/terms of use.</w:t>
+      </w:r>
+    </w:p>
+  </w:comment>
+  <w:comment w:id="17" w:author="Author" w:initials="A">
+    <w:p>
+      <w:r>
+        <w:rPr>
+          <w:rStyle w:val="CommentReference"/>
+        </w:rPr>
+        <w:annotationRef/>
+      </w:r>
+      <w:r>
+        <w:rPr>
+          <w:sz w:val="20"/>
+          <w:szCs w:val="20"/>
+        </w:rPr>
+        <w:t>A short (&lt; 100 words) description of the code. Additional details can be provided in README file(s) accompany the materials. If no code is provided, please state this and say why (e.g., if the paper contains no computational work).</w:t>
+      </w:r>
+    </w:p>
+  </w:comment>
+  <w:comment w:id="19" w:author="Author" w:date="2020-04-25T15:22:00Z" w:initials="CP">
     <w:p>
       <w:pPr>
         <w:pStyle w:val="CommentText"/>
@@ -4171,22 +4420,235 @@
         <w:annotationRef/>
       </w:r>
       <w:r>
+        <w:t>Check all that apply.</w:t>
+      </w:r>
+    </w:p>
+  </w:comment>
+  <w:comment w:id="21" w:author="Author" w:date="2023-10-11T18:31:00Z" w:initials="A">
+    <w:p>
+      <w:r>
         <w:rPr>
           <w:rStyle w:val="CommentReference"/>
         </w:rPr>
         <w:annotationRef/>
       </w:r>
       <w:r>
-        <w:t>If the data are only available by request to the authors or some other data owner, please make sure to explain the process of requesting access to the data.</w:t>
-      </w:r>
-    </w:p>
+        <w:rPr>
+          <w:color w:val="000000"/>
+          <w:sz w:val="20"/>
+          <w:szCs w:val="20"/>
+        </w:rPr>
+        <w:t>Please cite all software packages in the References Section in similar fashion to paper citations, citing packages that are foundational to the research outcome (including packages that implement methods to which you compare your methods). You may elect to not cite packages used for supporting purposes. For R packages, note that running `citation(‘name_of_package’)` often shows how the package authors wish to be cited.</w:t>
+      </w:r>
+    </w:p>
+  </w:comment>
+  <w:comment w:id="22" w:author="Author" w:date="2020-04-25T15:22:00Z" w:initials="CP">
+    <w:p>
+      <w:r>
+        <w:rPr>
+          <w:rStyle w:val="CommentReference"/>
+        </w:rPr>
+        <w:annotationRef/>
+      </w:r>
+      <w:r>
+        <w:rPr>
+          <w:sz w:val="20"/>
+          <w:szCs w:val="20"/>
+        </w:rPr>
+        <w:t>List key software used here. Include version number(s) if not otherwise documentd in the material provided.</w:t>
+      </w:r>
+    </w:p>
+    <w:p/>
+    <w:p>
+      <w:r>
+        <w:rPr>
+          <w:sz w:val="20"/>
+          <w:szCs w:val="20"/>
+        </w:rPr>
+        <w:t>For example: R version 4.5.1.</w:t>
+      </w:r>
+    </w:p>
+  </w:comment>
+  <w:comment w:id="23" w:author="Author" w:date="2020-04-25T15:23:00Z" w:initials="CP">
+    <w:p>
+      <w:r>
+        <w:rPr>
+          <w:rStyle w:val="CommentReference"/>
+        </w:rPr>
+        <w:annotationRef/>
+      </w:r>
+      <w:r>
+        <w:rPr>
+          <w:sz w:val="20"/>
+          <w:szCs w:val="20"/>
+        </w:rPr>
+        <w:t>List packages (e.g., R or Python packages) and libraries here, including version numbers (e.g., version numbers for any R or Python packages used) if not otherwise documented with the materials provided (e.g., an `renv` lock file or Conda environment file or in a README).</w:t>
+      </w:r>
+    </w:p>
+    <w:p/>
+    <w:p>
+      <w:r>
+        <w:rPr>
+          <w:sz w:val="20"/>
+          <w:szCs w:val="20"/>
+        </w:rPr>
+        <w:t>If documented with the materials, indicate here where to find the package and version information.</w:t>
+      </w:r>
+    </w:p>
+  </w:comment>
+  <w:comment w:id="24" w:author="Author" w:initials="A">
+    <w:p>
+      <w:pPr>
+        <w:rPr>
+          <w:sz w:val="20"/>
+          <w:szCs w:val="20"/>
+        </w:rPr>
+      </w:pPr>
+      <w:r>
+        <w:rPr>
+          <w:rStyle w:val="CommentReference"/>
+        </w:rPr>
+        <w:annotationRef/>
+      </w:r>
+      <w:r>
+        <w:rPr>
+          <w:sz w:val="20"/>
+          <w:szCs w:val="20"/>
+        </w:rPr>
+        <w:t>System/h</w:t>
+      </w:r>
+      <w:r>
+        <w:rPr>
+          <w:sz w:val="20"/>
+          <w:szCs w:val="20"/>
+        </w:rPr>
+        <w:t>ardware requirements including operating system with version number</w:t>
+      </w:r>
+      <w:r>
+        <w:rPr>
+          <w:sz w:val="20"/>
+          <w:szCs w:val="20"/>
+        </w:rPr>
+        <w:t>, access to cluster, GPUs, etc.</w:t>
+      </w:r>
+    </w:p>
+  </w:comment>
+  <w:comment w:id="25" w:author="Author" w:initials="A">
+    <w:p>
+      <w:r>
+        <w:rPr>
+          <w:rStyle w:val="CommentReference"/>
+        </w:rPr>
+        <w:annotationRef/>
+      </w:r>
+      <w:r>
+        <w:rPr>
+          <w:sz w:val="20"/>
+          <w:szCs w:val="20"/>
+        </w:rPr>
+        <w:t>For more complicated situations, more details can be provided in README file(s) accompanying the materials.</w:t>
+      </w:r>
+    </w:p>
+  </w:comment>
+  <w:comment w:id="28" w:author="Author" w:date="2020-04-25T15:24:00Z" w:initials="CP">
+    <w:p>
+      <w:r>
+        <w:rPr>
+          <w:rStyle w:val="CommentReference"/>
+        </w:rPr>
+        <w:annotationRef/>
+      </w:r>
+      <w:r>
+        <w:rPr>
+          <w:sz w:val="20"/>
+          <w:szCs w:val="20"/>
+          <w:lang w:val="en-US"/>
+        </w:rPr>
+        <w:t>By default, supplementary material will be archived on figshare by JASA. Authors are strongly encouraged to also make their code available in a public code repository, such as on GitHub, GitLab, or BitBucket. If relevant, please provide unique identifier/DOI/version information (e.g., a Git commit ID, branch, release, or tag).</w:t>
+      </w:r>
+      <w:r>
+        <w:rPr>
+          <w:sz w:val="20"/>
+          <w:szCs w:val="20"/>
+          <w:lang w:val="en-US"/>
+        </w:rPr>
+        <w:cr/>
+      </w:r>
+      <w:r>
+        <w:rPr>
+          <w:sz w:val="20"/>
+          <w:szCs w:val="20"/>
+          <w:lang w:val="en-US"/>
+        </w:rPr>
+        <w:cr/>
+        <w:t>If the code and workflow are provided together, this section may be omitted, with information provided in the "Location" section below.</w:t>
+      </w:r>
+    </w:p>
+  </w:comment>
+  <w:comment w:id="29" w:author="Author" w:date="2020-04-25T15:26:00Z" w:initials="CP">
     <w:p>
       <w:pPr>
         <w:pStyle w:val="CommentText"/>
       </w:pPr>
+      <w:r>
+        <w:rPr>
+          <w:rStyle w:val="CommentReference"/>
+        </w:rPr>
+        <w:annotationRef/>
+      </w:r>
+      <w:r>
+        <w:t>The materials provided should provide a straightforward way for reviewers and readers to reproduce analyses with as few steps as possible.</w:t>
+      </w:r>
     </w:p>
   </w:comment>
-  <w:comment w:id="9" w:author="Author" w:initials="A">
+  <w:comment w:id="32" w:author="Author" w:date="2020-04-25T15:26:00Z" w:initials="CP">
+    <w:p>
+      <w:r>
+        <w:rPr>
+          <w:rStyle w:val="CommentReference"/>
+        </w:rPr>
+        <w:annotationRef/>
+      </w:r>
+      <w:r>
+        <w:rPr>
+          <w:sz w:val="20"/>
+          <w:szCs w:val="20"/>
+        </w:rPr>
+        <w:t>Check all that apply, and in the case of a Git repository include unique identifier, such as specific commit ID, branch, release, or tag.</w:t>
+      </w:r>
+    </w:p>
+    <w:p/>
+    <w:p>
+      <w:r>
+        <w:rPr>
+          <w:sz w:val="20"/>
+          <w:szCs w:val="20"/>
+        </w:rPr>
+        <w:t>Indicate where the materials (generally including the code, unless in a separate location and indicated in the previous section) are available.</w:t>
+      </w:r>
+    </w:p>
+    <w:p/>
+    <w:p>
+      <w:r>
+        <w:rPr>
+          <w:sz w:val="20"/>
+          <w:szCs w:val="20"/>
+        </w:rPr>
+        <w:t>We strongly encourage authors to place their materials (but not large datasets) in a Git repository hosted on a site such as GitHub, GitLab, or BitBucket. If the repository is private during the review process, please indicate the location where it will be available publicly upon publication.</w:t>
+      </w:r>
+    </w:p>
+    <w:p/>
+    <w:p>
+      <w:r>
+        <w:rPr>
+          <w:sz w:val="20"/>
+          <w:szCs w:val="20"/>
+        </w:rPr>
+        <w:t>If materials are provided in a Git repository, to ensure long-term availability, make sure that you have also either included the materials in the supplementary material (e.g., as a zip file obtained directly from the Git hosting service) or placed them in a permanent archive with a DOI, such as in Zenodo.</w:t>
+      </w:r>
+    </w:p>
+  </w:comment>
+  <w:comment w:id="33" w:author="Author" w:date="2020-04-25T15:26:00Z" w:initials="CP">
     <w:p>
       <w:pPr>
         <w:pStyle w:val="CommentText"/>
@@ -4198,28 +4660,65 @@
         <w:annotationRef/>
       </w:r>
       <w:r>
-        <w:t>If the data for this manuscript are publicly available, skip to the Description section below. Otherwise, continue.</w:t>
-      </w:r>
-    </w:p>
+        <w:t>Check all that apply</w:t>
+      </w:r>
+    </w:p>
+  </w:comment>
+  <w:comment w:id="35" w:author="Author" w:initials="A">
+    <w:p>
+      <w:r>
+        <w:rPr>
+          <w:rStyle w:val="CommentReference"/>
+        </w:rPr>
+        <w:annotationRef/>
+      </w:r>
+      <w:r>
+        <w:rPr>
+          <w:sz w:val="20"/>
+          <w:szCs w:val="20"/>
+        </w:rPr>
+        <w:t>Describe how to use the materials provided to reproduce analyses in the manuscript. For more complicated workflows, it is best to provide a short summary here with full details provided in README file(s)  accompanying the reproducibility materials. If no workflow is provided, please state this and say why (e.g., if the paper contains no computational work).</w:t>
+      </w:r>
+    </w:p>
+  </w:comment>
+  <w:comment w:id="36" w:author="Author" w:initials="A">
+    <w:p>
+      <w:r>
+        <w:rPr>
+          <w:rStyle w:val="CommentReference"/>
+        </w:rPr>
+        <w:annotationRef/>
+      </w:r>
+      <w:r>
+        <w:rPr>
+          <w:sz w:val="20"/>
+          <w:szCs w:val="20"/>
+        </w:rPr>
+        <w:t>For more complicated situations, including cases where run-time varies greatly across different analyses, more details can be provided in README file(s) that accompany the materials.</w:t>
+      </w:r>
+    </w:p>
+  </w:comment>
+  <w:comment w:id="37" w:author="Author" w:initials="A">
     <w:p>
       <w:pPr>
         <w:pStyle w:val="CommentText"/>
       </w:pPr>
-    </w:p>
-    <w:p>
-      <w:pPr>
-        <w:pStyle w:val="CommentText"/>
-      </w:pPr>
-      <w:r>
-        <w:t>The Journal of the American Statistical Association requires authors to make data accompanying their papers available to the scientific community except in cases where: 1) public sharing of data would be impossible, 2) suitable synthetic data are provided which allow the main analyses to be replicated (recognizing that results may differ from the "real" data analyses), and 3) the scientific value of the results and methods outweigh the lack of reproducibility.</w:t>
+      <w:r>
+        <w:rPr>
+          <w:rStyle w:val="CommentReference"/>
+        </w:rPr>
+        <w:annotationRef/>
+      </w:r>
+      <w:r>
+        <w:t>Additional documentation provided (e.g., R package vignettes, demos or other examples) that show how to use the provided code/software in other settings</w:t>
+      </w:r>
+      <w:r>
+        <w:t>.</w:t>
       </w:r>
     </w:p>
   </w:comment>
-  <w:comment w:id="10" w:author="Author" w:initials="A">
-    <w:p>
-      <w:pPr>
-        <w:pStyle w:val="CommentText"/>
-      </w:pPr>
+  <w:comment w:id="39" w:author="Author" w:initials="A">
+    <w:p>
       <w:r>
         <w:rPr>
           <w:rStyle w:val="CommentReference"/>
@@ -4227,392 +4726,11 @@
         <w:annotationRef/>
       </w:r>
       <w:r>
-        <w:t>For example:</w:t>
-      </w:r>
-    </w:p>
-    <w:p>
-      <w:pPr>
-        <w:pStyle w:val="CommentText"/>
-        <w:numPr>
-          <w:ilvl w:val="0"/>
-          <w:numId w:val="1"/>
-        </w:numPr>
-      </w:pPr>
-      <w:r>
-        <w:t xml:space="preserve"> why data sharing is not possible,</w:t>
-      </w:r>
-    </w:p>
-    <w:p>
-      <w:pPr>
-        <w:pStyle w:val="CommentText"/>
-        <w:numPr>
-          <w:ilvl w:val="0"/>
-          <w:numId w:val="1"/>
-        </w:numPr>
-      </w:pPr>
-      <w:r>
-        <w:t xml:space="preserve"> what synthetic data are provided, and </w:t>
-      </w:r>
-    </w:p>
-    <w:p>
-      <w:pPr>
-        <w:pStyle w:val="CommentText"/>
-        <w:numPr>
-          <w:ilvl w:val="0"/>
-          <w:numId w:val="1"/>
-        </w:numPr>
-      </w:pPr>
-      <w:r>
-        <w:t xml:space="preserve"> why the value of the paper's scientific contribution outweighs the lack of reproducibility.</w:t>
-      </w:r>
-    </w:p>
-  </w:comment>
-  <w:comment w:id="13" w:author="Author" w:date="2020-04-25T15:22:00Z" w:initials="CP">
-    <w:p>
-      <w:pPr>
-        <w:pStyle w:val="CommentText"/>
-      </w:pPr>
-      <w:r>
-        <w:rPr>
-          <w:rStyle w:val="CommentReference"/>
-        </w:rPr>
-        <w:annotationRef/>
-      </w:r>
-      <w:r>
-        <w:t>Check all that apply.</w:t>
-      </w:r>
-    </w:p>
-  </w:comment>
-  <w:comment w:id="15" w:author="Author" w:date="2020-04-25T15:20:00Z" w:initials="CP">
-    <w:p>
-      <w:pPr>
-        <w:pStyle w:val="CommentText"/>
-      </w:pPr>
-      <w:r>
-        <w:rPr>
-          <w:rStyle w:val="CommentReference"/>
-        </w:rPr>
-        <w:annotationRef/>
-      </w:r>
-      <w:r>
-        <w:t>A data dictionary provides information that allows users to understand the meaning, format, and use of the data.</w:t>
-      </w:r>
-    </w:p>
-  </w:comment>
-  <w:comment w:id="16" w:author="Author" w:date="2020-04-25T15:36:00Z" w:initials="CP">
-    <w:p>
-      <w:pPr>
-        <w:pStyle w:val="CommentText"/>
-      </w:pPr>
-      <w:r>
-        <w:rPr>
-          <w:rStyle w:val="CommentReference"/>
-        </w:rPr>
-        <w:annotationRef/>
-      </w:r>
-      <w:r>
-        <w:t>Provide any details that would be helpful in understanding the data. If relevant, provide unique identifier/DOI/version information and/or license/terms of use.</w:t>
-      </w:r>
-    </w:p>
-  </w:comment>
-  <w:comment w:id="17" w:author="Author" w:initials="A">
-    <w:p>
-      <w:pPr>
-        <w:pStyle w:val="CommentText"/>
-      </w:pPr>
-      <w:r>
-        <w:rPr>
-          <w:rStyle w:val="CommentReference"/>
-        </w:rPr>
-        <w:annotationRef/>
-      </w:r>
-      <w:r>
-        <w:t>A short (</w:t>
-      </w:r>
-      <w:r>
-        <w:t>&lt; 1</w:t>
-      </w:r>
-      <w:r>
-        <w:t>00 words) description of the</w:t>
-      </w:r>
-      <w:r>
-        <w:t xml:space="preserve"> code. If necessary, more details can be provided in files that accompany the code.</w:t>
-      </w:r>
-      <w:r>
-        <w:t xml:space="preserve"> If no code is provided, please state this and say why (e.g., if the paper contains no computational work).</w:t>
-      </w:r>
-    </w:p>
-  </w:comment>
-  <w:comment w:id="19" w:author="Author" w:date="2020-04-25T15:22:00Z" w:initials="CP">
-    <w:p>
-      <w:pPr>
-        <w:pStyle w:val="CommentText"/>
-      </w:pPr>
-      <w:r>
-        <w:rPr>
-          <w:rStyle w:val="CommentReference"/>
-        </w:rPr>
-        <w:annotationRef/>
-      </w:r>
-      <w:r>
-        <w:t>Check all that apply.</w:t>
-      </w:r>
-    </w:p>
-  </w:comment>
-  <w:comment w:id="21" w:author="Author" w:date="2023-10-11T18:31:00Z" w:initials="A">
-    <w:p>
-      <w:r>
-        <w:rPr>
-          <w:rStyle w:val="CommentReference"/>
-        </w:rPr>
-        <w:annotationRef/>
-      </w:r>
-      <w:r>
-        <w:rPr>
-          <w:color w:val="000000"/>
+        <w:rPr>
           <w:sz w:val="20"/>
           <w:szCs w:val="20"/>
         </w:rPr>
-        <w:t>Please cite all software packages in the References Section in similar fashion to paper citations, citing packages that are foundational to the research outcome (including packages that implement methods to which you compare your methods). You may elect to not cite packages used for supporting purposes. For R packages, note that running `citation(‘name_of_package’)` often shows how the package authors wish to be cited.</w:t>
-      </w:r>
-    </w:p>
-  </w:comment>
-  <w:comment w:id="22" w:author="Author" w:date="2020-04-25T15:22:00Z" w:initials="CP">
-    <w:p>
-      <w:pPr>
-        <w:pStyle w:val="CommentText"/>
-      </w:pPr>
-      <w:r>
-        <w:rPr>
-          <w:rStyle w:val="CommentReference"/>
-        </w:rPr>
-        <w:annotationRef/>
-      </w:r>
-      <w:r>
-        <w:t>For example, R version 3.6.2.</w:t>
-      </w:r>
-    </w:p>
-  </w:comment>
-  <w:comment w:id="23" w:author="Author" w:date="2020-04-25T15:23:00Z" w:initials="CP">
-    <w:p>
-      <w:pPr>
-        <w:pStyle w:val="CommentText"/>
-      </w:pPr>
-      <w:r>
-        <w:rPr>
-          <w:rStyle w:val="CommentReference"/>
-        </w:rPr>
-        <w:annotationRef/>
-      </w:r>
-      <w:r>
-        <w:t>Include version numbers (e.g., version numbers for any R or Python packages used)</w:t>
-      </w:r>
-    </w:p>
-  </w:comment>
-  <w:comment w:id="24" w:author="Author" w:initials="A">
-    <w:p>
-      <w:pPr>
-        <w:rPr>
-          <w:sz w:val="20"/>
-          <w:szCs w:val="20"/>
-        </w:rPr>
-      </w:pPr>
-      <w:r>
-        <w:rPr>
-          <w:rStyle w:val="CommentReference"/>
-        </w:rPr>
-        <w:annotationRef/>
-      </w:r>
-      <w:r>
-        <w:rPr>
-          <w:sz w:val="20"/>
-          <w:szCs w:val="20"/>
-        </w:rPr>
-        <w:t>System/h</w:t>
-      </w:r>
-      <w:r>
-        <w:rPr>
-          <w:sz w:val="20"/>
-          <w:szCs w:val="20"/>
-        </w:rPr>
-        <w:t>ardware requirements including operating system with version number</w:t>
-      </w:r>
-      <w:r>
-        <w:rPr>
-          <w:sz w:val="20"/>
-          <w:szCs w:val="20"/>
-        </w:rPr>
-        <w:t>, access to cluster, GPUs, etc.</w:t>
-      </w:r>
-    </w:p>
-  </w:comment>
-  <w:comment w:id="27" w:author="Author" w:date="2020-04-25T15:24:00Z" w:initials="CP">
-    <w:p>
-      <w:pPr>
-        <w:pStyle w:val="CommentText"/>
-      </w:pPr>
-      <w:r>
-        <w:rPr>
-          <w:rStyle w:val="CommentReference"/>
-        </w:rPr>
-        <w:annotationRef/>
-      </w:r>
-      <w:r>
-        <w:t>By default, submitted code will be published on the JASA Git</w:t>
-      </w:r>
-      <w:r>
-        <w:t>H</w:t>
-      </w:r>
-      <w:r>
-        <w:t xml:space="preserve">ub repository (https://github.com/jasa-acs) as well as in the supplementary material. Authors are encouraged to also make their code available in a public </w:t>
-      </w:r>
-      <w:r>
-        <w:t xml:space="preserve">code </w:t>
-      </w:r>
-      <w:r>
-        <w:t>repository</w:t>
-      </w:r>
-      <w:r>
-        <w:t>, such as GitHub, GitLab, or BitBucket</w:t>
-      </w:r>
-      <w:r>
-        <w:t>. If relevant, please provide unique identifier/DOI/version information</w:t>
-      </w:r>
-      <w:r>
-        <w:t xml:space="preserve"> (e.g., a Git commit ID, branch release or tag)</w:t>
-      </w:r>
-      <w:r>
-        <w:t>.</w:t>
-      </w:r>
-      <w:r>
-        <w:t xml:space="preserve"> If the code and workflow are provided together, this section may be omitted, with information provided in the “Location” section below.</w:t>
-      </w:r>
-    </w:p>
-  </w:comment>
-  <w:comment w:id="28" w:author="Author" w:date="2020-04-25T15:26:00Z" w:initials="CP">
-    <w:p>
-      <w:pPr>
-        <w:pStyle w:val="CommentText"/>
-      </w:pPr>
-      <w:r>
-        <w:rPr>
-          <w:rStyle w:val="CommentReference"/>
-        </w:rPr>
-        <w:annotationRef/>
-      </w:r>
-      <w:r>
-        <w:t>The materials provided should provide a straightforward way for reviewers and readers to reproduce analyses with as few steps as possible.</w:t>
-      </w:r>
-    </w:p>
-  </w:comment>
-  <w:comment w:id="31" w:author="Author" w:date="2020-04-25T15:26:00Z" w:initials="CP">
-    <w:p>
-      <w:pPr>
-        <w:pStyle w:val="CommentText"/>
-      </w:pPr>
-      <w:r>
-        <w:rPr>
-          <w:rStyle w:val="CommentReference"/>
-        </w:rPr>
-        <w:annotationRef/>
-      </w:r>
-      <w:r>
-        <w:t>Check all that apply, and in the case of a Git repository include unique identifier, such as specific commit ID, branch, release, or tag.</w:t>
-      </w:r>
-    </w:p>
-    <w:p>
-      <w:pPr>
-        <w:pStyle w:val="CommentText"/>
-      </w:pPr>
-    </w:p>
-    <w:p>
-      <w:pPr>
-        <w:pStyle w:val="CommentText"/>
-      </w:pPr>
-      <w:r>
-        <w:t>Indicate where the materials (generally including the code, unless in a separate location and indicated in the previous section) are available. We strongly encourage authors to place their materials (but not large datasets) in a Git repository hosted on a site such as GitHub, GitLab, or BitBucket. If the repository is private during the review process, please indicate the location where it will be available publicly upon publication, and also include the materials as a zip file (e.g., obtained directly from the Git hosting site) as supplementary materials.</w:t>
-      </w:r>
-    </w:p>
-  </w:comment>
-  <w:comment w:id="32" w:author="Author" w:date="2020-04-25T15:26:00Z" w:initials="CP">
-    <w:p>
-      <w:pPr>
-        <w:pStyle w:val="CommentText"/>
-      </w:pPr>
-      <w:r>
-        <w:rPr>
-          <w:rStyle w:val="CommentReference"/>
-        </w:rPr>
-        <w:annotationRef/>
-      </w:r>
-      <w:r>
-        <w:t>Check all that apply</w:t>
-      </w:r>
-    </w:p>
-  </w:comment>
-  <w:comment w:id="34" w:author="Author" w:initials="A">
-    <w:p>
-      <w:pPr>
-        <w:pStyle w:val="CommentText"/>
-      </w:pPr>
-      <w:r>
-        <w:rPr>
-          <w:rStyle w:val="CommentReference"/>
-        </w:rPr>
-        <w:annotationRef/>
-      </w:r>
-      <w:r>
-        <w:t>Describe how to use the materials provided to reproduce analyses in the manuscript</w:t>
-      </w:r>
-      <w:r>
-        <w:t>.</w:t>
-      </w:r>
-      <w:r>
-        <w:t xml:space="preserve"> Additional details can be provided in file(s) accompanying the reproducibility materials.</w:t>
-      </w:r>
-      <w:r>
-        <w:t xml:space="preserve"> If no workflow is provided, please state this and say why (e.g., if the paper contains no computational work).</w:t>
-      </w:r>
-    </w:p>
-  </w:comment>
-  <w:comment w:id="35" w:author="Author" w:initials="A">
-    <w:p>
-      <w:pPr>
-        <w:pStyle w:val="CommentText"/>
-      </w:pPr>
-      <w:r>
-        <w:rPr>
-          <w:rStyle w:val="CommentReference"/>
-        </w:rPr>
-        <w:annotationRef/>
-      </w:r>
-      <w:r>
-        <w:t>Additional documentation provided (e.g., R package vignettes, demos or other examples) that show how to use the provided code/software in other settings</w:t>
-      </w:r>
-      <w:r>
-        <w:t>.</w:t>
-      </w:r>
-    </w:p>
-  </w:comment>
-  <w:comment w:id="37" w:author="Author" w:initials="A">
-    <w:p>
-      <w:pPr>
-        <w:pStyle w:val="CommentText"/>
-      </w:pPr>
-      <w:r>
-        <w:rPr>
-          <w:rStyle w:val="CommentReference"/>
-        </w:rPr>
-        <w:annotationRef/>
-      </w:r>
-      <w:r>
-        <w:t>Any other relevant information not covered on this form</w:t>
-      </w:r>
-      <w:r>
-        <w:t>.</w:t>
-      </w:r>
-      <w:r>
-        <w:t xml:space="preserve"> If reproducibility materials are not publicly available at the time of submission, please provide information here on how the reviewers can view the materials (and make sure to remove this information when submitting the final version of this form for an accepted manuscript).</w:t>
+        <w:t>Any other relevant information not covered on this form.</w:t>
       </w:r>
     </w:p>
   </w:comment>
@@ -4620,7 +4738,7 @@
 </file>
 
 <file path=word/commentsExtended.xml><?xml version="1.0" encoding="utf-8"?>
-<w15:commentsEx xmlns:wpc="http://schemas.microsoft.com/office/word/2010/wordprocessingCanvas" xmlns:cx="http://schemas.microsoft.com/office/drawing/2014/chartex" xmlns:cx1="http://schemas.microsoft.com/office/drawing/2015/9/8/chartex" xmlns:cx2="http://schemas.microsoft.com/office/drawing/2015/10/21/chartex" xmlns:cx3="http://schemas.microsoft.com/office/drawing/2016/5/9/chartex" xmlns:cx4="http://schemas.microsoft.com/office/drawing/2016/5/10/chartex" xmlns:cx5="http://schemas.microsoft.com/office/drawing/2016/5/11/chartex" xmlns:cx6="http://schemas.microsoft.com/office/drawing/2016/5/12/chartex" xmlns:cx7="http://schemas.microsoft.com/office/drawing/2016/5/13/chartex" xmlns:cx8="http://schemas.microsoft.com/office/drawing/2016/5/14/chartex" xmlns:mc="http://schemas.openxmlformats.org/markup-compatibility/2006" xmlns:aink="http://schemas.microsoft.com/office/drawing/2016/ink" xmlns:am3d="http://schemas.microsoft.com/office/drawing/2017/model3d" xmlns:o="urn:schemas-microsoft-com:office:office" xmlns:oel="http://schemas.microsoft.com/office/2019/extlst" xmlns:r="http://schemas.openxmlformats.org/officeDocument/2006/relationships" xmlns:m="http://schemas.openxmlformats.org/officeDocument/2006/math" xmlns:v="urn:schemas-microsoft-com:vml" xmlns:wp14="http://schemas.microsoft.com/office/word/2010/wordprocessingDrawing" xmlns:wp="http://schemas.openxmlformats.org/drawingml/2006/wordprocessingDrawing" xmlns:w10="urn:schemas-microsoft-com:office:word" xmlns:w="http://schemas.openxmlformats.org/wordprocessingml/2006/main" xmlns:w14="http://schemas.microsoft.com/office/word/2010/wordml" xmlns:w15="http://schemas.microsoft.com/office/word/2012/wordml" xmlns:w16cex="http://schemas.microsoft.com/office/word/2018/wordml/cex" xmlns:w16cid="http://schemas.microsoft.com/office/word/2016/wordml/cid" xmlns:w16="http://schemas.microsoft.com/office/word/2018/wordml" xmlns:w16sdtdh="http://schemas.microsoft.com/office/word/2020/wordml/sdtdatahash" xmlns:w16se="http://schemas.microsoft.com/office/word/2015/wordml/symex" xmlns:wpg="http://schemas.microsoft.com/office/word/2010/wordprocessingGroup" xmlns:wpi="http://schemas.microsoft.com/office/word/2010/wordprocessingInk" xmlns:wne="http://schemas.microsoft.com/office/word/2006/wordml" xmlns:wps="http://schemas.microsoft.com/office/word/2010/wordprocessingShape" mc:Ignorable="w14 w15 w16se w16cid w16 w16cex w16sdtdh wp14">
+<w15:commentsEx xmlns:wpc="http://schemas.microsoft.com/office/word/2010/wordprocessingCanvas" xmlns:cx="http://schemas.microsoft.com/office/drawing/2014/chartex" xmlns:cx1="http://schemas.microsoft.com/office/drawing/2015/9/8/chartex" xmlns:cx2="http://schemas.microsoft.com/office/drawing/2015/10/21/chartex" xmlns:cx3="http://schemas.microsoft.com/office/drawing/2016/5/9/chartex" xmlns:cx4="http://schemas.microsoft.com/office/drawing/2016/5/10/chartex" xmlns:cx5="http://schemas.microsoft.com/office/drawing/2016/5/11/chartex" xmlns:cx6="http://schemas.microsoft.com/office/drawing/2016/5/12/chartex" xmlns:cx7="http://schemas.microsoft.com/office/drawing/2016/5/13/chartex" xmlns:cx8="http://schemas.microsoft.com/office/drawing/2016/5/14/chartex" xmlns:mc="http://schemas.openxmlformats.org/markup-compatibility/2006" xmlns:aink="http://schemas.microsoft.com/office/drawing/2016/ink" xmlns:am3d="http://schemas.microsoft.com/office/drawing/2017/model3d" xmlns:o="urn:schemas-microsoft-com:office:office" xmlns:oel="http://schemas.microsoft.com/office/2019/extlst" xmlns:r="http://schemas.openxmlformats.org/officeDocument/2006/relationships" xmlns:m="http://schemas.openxmlformats.org/officeDocument/2006/math" xmlns:v="urn:schemas-microsoft-com:vml" xmlns:wp14="http://schemas.microsoft.com/office/word/2010/wordprocessingDrawing" xmlns:wp="http://schemas.openxmlformats.org/drawingml/2006/wordprocessingDrawing" xmlns:w10="urn:schemas-microsoft-com:office:word" xmlns:w="http://schemas.openxmlformats.org/wordprocessingml/2006/main" xmlns:w14="http://schemas.microsoft.com/office/word/2010/wordml" xmlns:w15="http://schemas.microsoft.com/office/word/2012/wordml" xmlns:w16cex="http://schemas.microsoft.com/office/word/2018/wordml/cex" xmlns:w16cid="http://schemas.microsoft.com/office/word/2016/wordml/cid" xmlns:w16="http://schemas.microsoft.com/office/word/2018/wordml" xmlns:w16du="http://schemas.microsoft.com/office/word/2023/wordml/word16du" xmlns:w16sdtdh="http://schemas.microsoft.com/office/word/2020/wordml/sdtdatahash" xmlns:w16sdtfl="http://schemas.microsoft.com/office/word/2024/wordml/sdtformatlock" xmlns:w16se="http://schemas.microsoft.com/office/word/2015/wordml/symex" xmlns:wpg="http://schemas.microsoft.com/office/word/2010/wordprocessingGroup" xmlns:wpi="http://schemas.microsoft.com/office/word/2010/wordprocessingInk" xmlns:wne="http://schemas.microsoft.com/office/word/2006/wordml" xmlns:wps="http://schemas.microsoft.com/office/word/2010/wordprocessingShape" mc:Ignorable="w14 w15 w16se w16cid w16 w16cex w16sdtdh w16sdtfl w16du wp14">
   <w15:commentEx w15:paraId="3C843FD7" w15:done="0"/>
   <w15:commentEx w15:paraId="0444695B" w15:done="0"/>
   <w15:commentEx w15:paraId="4F8A765D" w15:done="0"/>
@@ -4636,18 +4754,20 @@
   <w15:commentEx w15:paraId="0BE0B11C" w15:done="0"/>
   <w15:commentEx w15:paraId="26A43973" w15:done="0"/>
   <w15:commentEx w15:paraId="3E9EE990" w15:done="0"/>
+  <w15:commentEx w15:paraId="4B0F8A2B" w15:done="0"/>
   <w15:commentEx w15:paraId="5388EA45" w15:done="0"/>
   <w15:commentEx w15:paraId="59F0F3F3" w15:done="0"/>
   <w15:commentEx w15:paraId="1BEFCE89" w15:done="0"/>
   <w15:commentEx w15:paraId="02BE8CD2" w15:done="0"/>
   <w15:commentEx w15:paraId="23177F7F" w15:done="0"/>
+  <w15:commentEx w15:paraId="5441BCD3" w15:done="0"/>
   <w15:commentEx w15:paraId="3EBDB957" w15:done="0"/>
   <w15:commentEx w15:paraId="0F7C1E24" w15:done="0"/>
 </w15:commentsEx>
 </file>
 
 <file path=word/commentsExtensible.xml><?xml version="1.0" encoding="utf-8"?>
-<w16cex:commentsExtensible xmlns:wpc="http://schemas.microsoft.com/office/word/2010/wordprocessingCanvas" xmlns:cx="http://schemas.microsoft.com/office/drawing/2014/chartex" xmlns:cx1="http://schemas.microsoft.com/office/drawing/2015/9/8/chartex" xmlns:cx2="http://schemas.microsoft.com/office/drawing/2015/10/21/chartex" xmlns:cx3="http://schemas.microsoft.com/office/drawing/2016/5/9/chartex" xmlns:cx4="http://schemas.microsoft.com/office/drawing/2016/5/10/chartex" xmlns:cx5="http://schemas.microsoft.com/office/drawing/2016/5/11/chartex" xmlns:cx6="http://schemas.microsoft.com/office/drawing/2016/5/12/chartex" xmlns:cx7="http://schemas.microsoft.com/office/drawing/2016/5/13/chartex" xmlns:cx8="http://schemas.microsoft.com/office/drawing/2016/5/14/chartex" xmlns:mc="http://schemas.openxmlformats.org/markup-compatibility/2006" xmlns:aink="http://schemas.microsoft.com/office/drawing/2016/ink" xmlns:am3d="http://schemas.microsoft.com/office/drawing/2017/model3d" xmlns:o="urn:schemas-microsoft-com:office:office" xmlns:oel="http://schemas.microsoft.com/office/2019/extlst" xmlns:r="http://schemas.openxmlformats.org/officeDocument/2006/relationships" xmlns:m="http://schemas.openxmlformats.org/officeDocument/2006/math" xmlns:v="urn:schemas-microsoft-com:vml" xmlns:wp14="http://schemas.microsoft.com/office/word/2010/wordprocessingDrawing" xmlns:wp="http://schemas.openxmlformats.org/drawingml/2006/wordprocessingDrawing" xmlns:w10="urn:schemas-microsoft-com:office:word" xmlns:w="http://schemas.openxmlformats.org/wordprocessingml/2006/main" xmlns:w14="http://schemas.microsoft.com/office/word/2010/wordml" xmlns:w15="http://schemas.microsoft.com/office/word/2012/wordml" xmlns:w16cex="http://schemas.microsoft.com/office/word/2018/wordml/cex" xmlns:w16cid="http://schemas.microsoft.com/office/word/2016/wordml/cid" xmlns:w16="http://schemas.microsoft.com/office/word/2018/wordml" xmlns:w16sdtdh="http://schemas.microsoft.com/office/word/2020/wordml/sdtdatahash" xmlns:w16se="http://schemas.microsoft.com/office/word/2015/wordml/symex" xmlns:wpg="http://schemas.microsoft.com/office/word/2010/wordprocessingGroup" xmlns:wpi="http://schemas.microsoft.com/office/word/2010/wordprocessingInk" xmlns:wne="http://schemas.microsoft.com/office/word/2006/wordml" xmlns:wps="http://schemas.microsoft.com/office/word/2010/wordprocessingShape" mc:Ignorable="w14 w15 w16se w16cid w16 w16cex w16sdtdh wp14">
+<w16cex:commentsExtensible xmlns:wpc="http://schemas.microsoft.com/office/word/2010/wordprocessingCanvas" xmlns:cx="http://schemas.microsoft.com/office/drawing/2014/chartex" xmlns:cx1="http://schemas.microsoft.com/office/drawing/2015/9/8/chartex" xmlns:cx2="http://schemas.microsoft.com/office/drawing/2015/10/21/chartex" xmlns:cx3="http://schemas.microsoft.com/office/drawing/2016/5/9/chartex" xmlns:cx4="http://schemas.microsoft.com/office/drawing/2016/5/10/chartex" xmlns:cx5="http://schemas.microsoft.com/office/drawing/2016/5/11/chartex" xmlns:cx6="http://schemas.microsoft.com/office/drawing/2016/5/12/chartex" xmlns:cx7="http://schemas.microsoft.com/office/drawing/2016/5/13/chartex" xmlns:cx8="http://schemas.microsoft.com/office/drawing/2016/5/14/chartex" xmlns:cr="http://schemas.microsoft.com/office/comments/2020/reactions" xmlns:mc="http://schemas.openxmlformats.org/markup-compatibility/2006" xmlns:aink="http://schemas.microsoft.com/office/drawing/2016/ink" xmlns:am3d="http://schemas.microsoft.com/office/drawing/2017/model3d" xmlns:o="urn:schemas-microsoft-com:office:office" xmlns:oel="http://schemas.microsoft.com/office/2019/extlst" xmlns:r="http://schemas.openxmlformats.org/officeDocument/2006/relationships" xmlns:m="http://schemas.openxmlformats.org/officeDocument/2006/math" xmlns:v="urn:schemas-microsoft-com:vml" xmlns:wp14="http://schemas.microsoft.com/office/word/2010/wordprocessingDrawing" xmlns:wp="http://schemas.openxmlformats.org/drawingml/2006/wordprocessingDrawing" xmlns:w10="urn:schemas-microsoft-com:office:word" xmlns:w="http://schemas.openxmlformats.org/wordprocessingml/2006/main" xmlns:w14="http://schemas.microsoft.com/office/word/2010/wordml" xmlns:w15="http://schemas.microsoft.com/office/word/2012/wordml" xmlns:w16cex="http://schemas.microsoft.com/office/word/2018/wordml/cex" xmlns:w16cid="http://schemas.microsoft.com/office/word/2016/wordml/cid" xmlns:w16="http://schemas.microsoft.com/office/word/2018/wordml" xmlns:w16du="http://schemas.microsoft.com/office/word/2023/wordml/word16du" xmlns:w16sdtdh="http://schemas.microsoft.com/office/word/2020/wordml/sdtdatahash" xmlns:w16sdtfl="http://schemas.microsoft.com/office/word/2024/wordml/sdtformatlock" xmlns:w16se="http://schemas.microsoft.com/office/word/2015/wordml/symex" xmlns:wpg="http://schemas.microsoft.com/office/word/2010/wordprocessingGroup" xmlns:wpi="http://schemas.microsoft.com/office/word/2010/wordprocessingInk" xmlns:wne="http://schemas.microsoft.com/office/word/2006/wordml" xmlns:wps="http://schemas.microsoft.com/office/word/2010/wordprocessingShape" mc:Ignorable="w14 w15 w16se w16cid w16 w16cex w16sdtdh w16sdtfl cr w16du wp14">
   <w16cex:commentExtensible w16cex:durableId="2250745D" w16cex:dateUtc="2020-04-27T03:58:00Z"/>
   <w16cex:commentExtensible w16cex:durableId="224ED420" w16cex:dateUtc="2020-04-25T22:22:00Z"/>
   <w16cex:commentExtensible w16cex:durableId="224ED3CA" w16cex:dateUtc="2020-04-25T22:20:00Z"/>
@@ -4664,7 +4784,7 @@
 </file>
 
 <file path=word/commentsIds.xml><?xml version="1.0" encoding="utf-8"?>
-<w16cid:commentsIds xmlns:wpc="http://schemas.microsoft.com/office/word/2010/wordprocessingCanvas" xmlns:cx="http://schemas.microsoft.com/office/drawing/2014/chartex" xmlns:cx1="http://schemas.microsoft.com/office/drawing/2015/9/8/chartex" xmlns:cx2="http://schemas.microsoft.com/office/drawing/2015/10/21/chartex" xmlns:cx3="http://schemas.microsoft.com/office/drawing/2016/5/9/chartex" xmlns:cx4="http://schemas.microsoft.com/office/drawing/2016/5/10/chartex" xmlns:cx5="http://schemas.microsoft.com/office/drawing/2016/5/11/chartex" xmlns:cx6="http://schemas.microsoft.com/office/drawing/2016/5/12/chartex" xmlns:cx7="http://schemas.microsoft.com/office/drawing/2016/5/13/chartex" xmlns:cx8="http://schemas.microsoft.com/office/drawing/2016/5/14/chartex" xmlns:mc="http://schemas.openxmlformats.org/markup-compatibility/2006" xmlns:aink="http://schemas.microsoft.com/office/drawing/2016/ink" xmlns:am3d="http://schemas.microsoft.com/office/drawing/2017/model3d" xmlns:o="urn:schemas-microsoft-com:office:office" xmlns:oel="http://schemas.microsoft.com/office/2019/extlst" xmlns:r="http://schemas.openxmlformats.org/officeDocument/2006/relationships" xmlns:m="http://schemas.openxmlformats.org/officeDocument/2006/math" xmlns:v="urn:schemas-microsoft-com:vml" xmlns:wp14="http://schemas.microsoft.com/office/word/2010/wordprocessingDrawing" xmlns:wp="http://schemas.openxmlformats.org/drawingml/2006/wordprocessingDrawing" xmlns:w10="urn:schemas-microsoft-com:office:word" xmlns:w="http://schemas.openxmlformats.org/wordprocessingml/2006/main" xmlns:w14="http://schemas.microsoft.com/office/word/2010/wordml" xmlns:w15="http://schemas.microsoft.com/office/word/2012/wordml" xmlns:w16cex="http://schemas.microsoft.com/office/word/2018/wordml/cex" xmlns:w16cid="http://schemas.microsoft.com/office/word/2016/wordml/cid" xmlns:w16="http://schemas.microsoft.com/office/word/2018/wordml" xmlns:w16sdtdh="http://schemas.microsoft.com/office/word/2020/wordml/sdtdatahash" xmlns:w16se="http://schemas.microsoft.com/office/word/2015/wordml/symex" xmlns:wpg="http://schemas.microsoft.com/office/word/2010/wordprocessingGroup" xmlns:wpi="http://schemas.microsoft.com/office/word/2010/wordprocessingInk" xmlns:wne="http://schemas.microsoft.com/office/word/2006/wordml" xmlns:wps="http://schemas.microsoft.com/office/word/2010/wordprocessingShape" mc:Ignorable="w14 w15 w16se w16cid w16 w16cex w16sdtdh wp14">
+<w16cid:commentsIds xmlns:wpc="http://schemas.microsoft.com/office/word/2010/wordprocessingCanvas" xmlns:cx="http://schemas.microsoft.com/office/drawing/2014/chartex" xmlns:cx1="http://schemas.microsoft.com/office/drawing/2015/9/8/chartex" xmlns:cx2="http://schemas.microsoft.com/office/drawing/2015/10/21/chartex" xmlns:cx3="http://schemas.microsoft.com/office/drawing/2016/5/9/chartex" xmlns:cx4="http://schemas.microsoft.com/office/drawing/2016/5/10/chartex" xmlns:cx5="http://schemas.microsoft.com/office/drawing/2016/5/11/chartex" xmlns:cx6="http://schemas.microsoft.com/office/drawing/2016/5/12/chartex" xmlns:cx7="http://schemas.microsoft.com/office/drawing/2016/5/13/chartex" xmlns:cx8="http://schemas.microsoft.com/office/drawing/2016/5/14/chartex" xmlns:mc="http://schemas.openxmlformats.org/markup-compatibility/2006" xmlns:aink="http://schemas.microsoft.com/office/drawing/2016/ink" xmlns:am3d="http://schemas.microsoft.com/office/drawing/2017/model3d" xmlns:o="urn:schemas-microsoft-com:office:office" xmlns:oel="http://schemas.microsoft.com/office/2019/extlst" xmlns:r="http://schemas.openxmlformats.org/officeDocument/2006/relationships" xmlns:m="http://schemas.openxmlformats.org/officeDocument/2006/math" xmlns:v="urn:schemas-microsoft-com:vml" xmlns:wp14="http://schemas.microsoft.com/office/word/2010/wordprocessingDrawing" xmlns:wp="http://schemas.openxmlformats.org/drawingml/2006/wordprocessingDrawing" xmlns:w10="urn:schemas-microsoft-com:office:word" xmlns:w="http://schemas.openxmlformats.org/wordprocessingml/2006/main" xmlns:w14="http://schemas.microsoft.com/office/word/2010/wordml" xmlns:w15="http://schemas.microsoft.com/office/word/2012/wordml" xmlns:w16cex="http://schemas.microsoft.com/office/word/2018/wordml/cex" xmlns:w16cid="http://schemas.microsoft.com/office/word/2016/wordml/cid" xmlns:w16="http://schemas.microsoft.com/office/word/2018/wordml" xmlns:w16du="http://schemas.microsoft.com/office/word/2023/wordml/word16du" xmlns:w16sdtdh="http://schemas.microsoft.com/office/word/2020/wordml/sdtdatahash" xmlns:w16sdtfl="http://schemas.microsoft.com/office/word/2024/wordml/sdtformatlock" xmlns:w16se="http://schemas.microsoft.com/office/word/2015/wordml/symex" xmlns:wpg="http://schemas.microsoft.com/office/word/2010/wordprocessingGroup" xmlns:wpi="http://schemas.microsoft.com/office/word/2010/wordprocessingInk" xmlns:wne="http://schemas.microsoft.com/office/word/2006/wordml" xmlns:wps="http://schemas.microsoft.com/office/word/2010/wordprocessingShape" mc:Ignorable="w14 w15 w16se w16cid w16 w16cex w16sdtdh w16sdtfl w16du wp14">
   <w16cid:commentId w16cid:paraId="3C843FD7" w16cid:durableId="224EB8A1"/>
   <w16cid:commentId w16cid:paraId="0444695B" w16cid:durableId="224EB8A2"/>
   <w16cid:commentId w16cid:paraId="4F8A765D" w16cid:durableId="224EB8A3"/>
@@ -4680,18 +4800,20 @@
   <w16cid:commentId w16cid:paraId="0BE0B11C" w16cid:durableId="224ED44C"/>
   <w16cid:commentId w16cid:paraId="26A43973" w16cid:durableId="224ED45E"/>
   <w16cid:commentId w16cid:paraId="3E9EE990" w16cid:durableId="224EB8A8"/>
+  <w16cid:commentId w16cid:paraId="4B0F8A2B" w16cid:durableId="4364E0F0"/>
   <w16cid:commentId w16cid:paraId="5388EA45" w16cid:durableId="224ED4BE"/>
   <w16cid:commentId w16cid:paraId="59F0F3F3" w16cid:durableId="224ED519"/>
   <w16cid:commentId w16cid:paraId="1BEFCE89" w16cid:durableId="2527CB62"/>
   <w16cid:commentId w16cid:paraId="02BE8CD2" w16cid:durableId="224ED540"/>
   <w16cid:commentId w16cid:paraId="23177F7F" w16cid:durableId="224EB8A9"/>
+  <w16cid:commentId w16cid:paraId="5441BCD3" w16cid:durableId="4FB46BC7"/>
   <w16cid:commentId w16cid:paraId="3EBDB957" w16cid:durableId="224EB8AB"/>
   <w16cid:commentId w16cid:paraId="0F7C1E24" w16cid:durableId="224EB8AC"/>
 </w16cid:commentsIds>
 </file>
 
 <file path=word/endnotes.xml><?xml version="1.0" encoding="utf-8"?>
-<w:endnotes xmlns:wpc="http://schemas.microsoft.com/office/word/2010/wordprocessingCanvas" xmlns:cx="http://schemas.microsoft.com/office/drawing/2014/chartex" xmlns:cx1="http://schemas.microsoft.com/office/drawing/2015/9/8/chartex" xmlns:cx2="http://schemas.microsoft.com/office/drawing/2015/10/21/chartex" xmlns:cx3="http://schemas.microsoft.com/office/drawing/2016/5/9/chartex" xmlns:cx4="http://schemas.microsoft.com/office/drawing/2016/5/10/chartex" xmlns:cx5="http://schemas.microsoft.com/office/drawing/2016/5/11/chartex" xmlns:cx6="http://schemas.microsoft.com/office/drawing/2016/5/12/chartex" xmlns:cx7="http://schemas.microsoft.com/office/drawing/2016/5/13/chartex" xmlns:cx8="http://schemas.microsoft.com/office/drawing/2016/5/14/chartex" xmlns:mc="http://schemas.openxmlformats.org/markup-compatibility/2006" xmlns:aink="http://schemas.microsoft.com/office/drawing/2016/ink" xmlns:am3d="http://schemas.microsoft.com/office/drawing/2017/model3d" xmlns:o="urn:schemas-microsoft-com:office:office" xmlns:oel="http://schemas.microsoft.com/office/2019/extlst" xmlns:r="http://schemas.openxmlformats.org/officeDocument/2006/relationships" xmlns:m="http://schemas.openxmlformats.org/officeDocument/2006/math" xmlns:v="urn:schemas-microsoft-com:vml" xmlns:wp14="http://schemas.microsoft.com/office/word/2010/wordprocessingDrawing" xmlns:wp="http://schemas.openxmlformats.org/drawingml/2006/wordprocessingDrawing" xmlns:w10="urn:schemas-microsoft-com:office:word" xmlns:w="http://schemas.openxmlformats.org/wordprocessingml/2006/main" xmlns:w14="http://schemas.microsoft.com/office/word/2010/wordml" xmlns:w15="http://schemas.microsoft.com/office/word/2012/wordml" xmlns:w16cex="http://schemas.microsoft.com/office/word/2018/wordml/cex" xmlns:w16cid="http://schemas.microsoft.com/office/word/2016/wordml/cid" xmlns:w16="http://schemas.microsoft.com/office/word/2018/wordml" xmlns:w16sdtdh="http://schemas.microsoft.com/office/word/2020/wordml/sdtdatahash" xmlns:w16se="http://schemas.microsoft.com/office/word/2015/wordml/symex" xmlns:wpg="http://schemas.microsoft.com/office/word/2010/wordprocessingGroup" xmlns:wpi="http://schemas.microsoft.com/office/word/2010/wordprocessingInk" xmlns:wne="http://schemas.microsoft.com/office/word/2006/wordml" xmlns:wps="http://schemas.microsoft.com/office/word/2010/wordprocessingShape" mc:Ignorable="w14 w15 w16se w16cid w16 w16cex w16sdtdh wp14">
+<w:endnotes xmlns:wpc="http://schemas.microsoft.com/office/word/2010/wordprocessingCanvas" xmlns:cx="http://schemas.microsoft.com/office/drawing/2014/chartex" xmlns:cx1="http://schemas.microsoft.com/office/drawing/2015/9/8/chartex" xmlns:cx2="http://schemas.microsoft.com/office/drawing/2015/10/21/chartex" xmlns:cx3="http://schemas.microsoft.com/office/drawing/2016/5/9/chartex" xmlns:cx4="http://schemas.microsoft.com/office/drawing/2016/5/10/chartex" xmlns:cx5="http://schemas.microsoft.com/office/drawing/2016/5/11/chartex" xmlns:cx6="http://schemas.microsoft.com/office/drawing/2016/5/12/chartex" xmlns:cx7="http://schemas.microsoft.com/office/drawing/2016/5/13/chartex" xmlns:cx8="http://schemas.microsoft.com/office/drawing/2016/5/14/chartex" xmlns:mc="http://schemas.openxmlformats.org/markup-compatibility/2006" xmlns:aink="http://schemas.microsoft.com/office/drawing/2016/ink" xmlns:am3d="http://schemas.microsoft.com/office/drawing/2017/model3d" xmlns:o="urn:schemas-microsoft-com:office:office" xmlns:oel="http://schemas.microsoft.com/office/2019/extlst" xmlns:r="http://schemas.openxmlformats.org/officeDocument/2006/relationships" xmlns:m="http://schemas.openxmlformats.org/officeDocument/2006/math" xmlns:v="urn:schemas-microsoft-com:vml" xmlns:wp14="http://schemas.microsoft.com/office/word/2010/wordprocessingDrawing" xmlns:wp="http://schemas.openxmlformats.org/drawingml/2006/wordprocessingDrawing" xmlns:w10="urn:schemas-microsoft-com:office:word" xmlns:w="http://schemas.openxmlformats.org/wordprocessingml/2006/main" xmlns:w14="http://schemas.microsoft.com/office/word/2010/wordml" xmlns:w15="http://schemas.microsoft.com/office/word/2012/wordml" xmlns:w16cex="http://schemas.microsoft.com/office/word/2018/wordml/cex" xmlns:w16cid="http://schemas.microsoft.com/office/word/2016/wordml/cid" xmlns:w16="http://schemas.microsoft.com/office/word/2018/wordml" xmlns:w16du="http://schemas.microsoft.com/office/word/2023/wordml/word16du" xmlns:w16sdtdh="http://schemas.microsoft.com/office/word/2020/wordml/sdtdatahash" xmlns:w16sdtfl="http://schemas.microsoft.com/office/word/2024/wordml/sdtformatlock" xmlns:w16se="http://schemas.microsoft.com/office/word/2015/wordml/symex" xmlns:wpg="http://schemas.microsoft.com/office/word/2010/wordprocessingGroup" xmlns:wpi="http://schemas.microsoft.com/office/word/2010/wordprocessingInk" xmlns:wne="http://schemas.microsoft.com/office/word/2006/wordml" xmlns:wps="http://schemas.microsoft.com/office/word/2010/wordprocessingShape" mc:Ignorable="w14 w15 w16se w16cid w16 w16cex w16sdtdh w16sdtfl w16du wp14">
   <w:endnote w:type="separator" w:id="-1">
     <w:p>
       <w:pPr>
@@ -4716,17 +4838,7 @@
 </file>
 
 <file path=word/footer1.xml><?xml version="1.0" encoding="utf-8"?>
-<w:ftr xmlns:wpc="http://schemas.microsoft.com/office/word/2010/wordprocessingCanvas" xmlns:cx="http://schemas.microsoft.com/office/drawing/2014/chartex" xmlns:cx1="http://schemas.microsoft.com/office/drawing/2015/9/8/chartex" xmlns:cx2="http://schemas.microsoft.com/office/drawing/2015/10/21/chartex" xmlns:cx3="http://schemas.microsoft.com/office/drawing/2016/5/9/chartex" xmlns:cx4="http://schemas.microsoft.com/office/drawing/2016/5/10/chartex" xmlns:cx5="http://schemas.microsoft.com/office/drawing/2016/5/11/chartex" xmlns:cx6="http://schemas.microsoft.com/office/drawing/2016/5/12/chartex" xmlns:cx7="http://schemas.microsoft.com/office/drawing/2016/5/13/chartex" xmlns:cx8="http://schemas.microsoft.com/office/drawing/2016/5/14/chartex" xmlns:mc="http://schemas.openxmlformats.org/markup-compatibility/2006" xmlns:aink="http://schemas.microsoft.com/office/drawing/2016/ink" xmlns:am3d="http://schemas.microsoft.com/office/drawing/2017/model3d" xmlns:o="urn:schemas-microsoft-com:office:office" xmlns:oel="http://schemas.microsoft.com/office/2019/extlst" xmlns:r="http://schemas.openxmlformats.org/officeDocument/2006/relationships" xmlns:m="http://schemas.openxmlformats.org/officeDocument/2006/math" xmlns:v="urn:schemas-microsoft-com:vml" xmlns:wp14="http://schemas.microsoft.com/office/word/2010/wordprocessingDrawing" xmlns:wp="http://schemas.openxmlformats.org/drawingml/2006/wordprocessingDrawing" xmlns:w10="urn:schemas-microsoft-com:office:word" xmlns:w="http://schemas.openxmlformats.org/wordprocessingml/2006/main" xmlns:w14="http://schemas.microsoft.com/office/word/2010/wordml" xmlns:w15="http://schemas.microsoft.com/office/word/2012/wordml" xmlns:w16cex="http://schemas.microsoft.com/office/word/2018/wordml/cex" xmlns:w16cid="http://schemas.microsoft.com/office/word/2016/wordml/cid" xmlns:w16="http://schemas.microsoft.com/office/word/2018/wordml" xmlns:w16sdtdh="http://schemas.microsoft.com/office/word/2020/wordml/sdtdatahash" xmlns:w16se="http://schemas.microsoft.com/office/word/2015/wordml/symex" xmlns:wpg="http://schemas.microsoft.com/office/word/2010/wordprocessingGroup" xmlns:wpi="http://schemas.microsoft.com/office/word/2010/wordprocessingInk" xmlns:wne="http://schemas.microsoft.com/office/word/2006/wordml" xmlns:wps="http://schemas.microsoft.com/office/word/2010/wordprocessingShape" mc:Ignorable="w14 w15 w16se w16cid w16 w16cex w16sdtdh wp14">
-  <w:p>
-    <w:pPr>
-      <w:pStyle w:val="Footer"/>
-    </w:pPr>
-  </w:p>
-</w:ftr>
-</file>
-
-<file path=word/footer2.xml><?xml version="1.0" encoding="utf-8"?>
-<w:ftr xmlns:wpc="http://schemas.microsoft.com/office/word/2010/wordprocessingCanvas" xmlns:cx="http://schemas.microsoft.com/office/drawing/2014/chartex" xmlns:cx1="http://schemas.microsoft.com/office/drawing/2015/9/8/chartex" xmlns:cx2="http://schemas.microsoft.com/office/drawing/2015/10/21/chartex" xmlns:cx3="http://schemas.microsoft.com/office/drawing/2016/5/9/chartex" xmlns:cx4="http://schemas.microsoft.com/office/drawing/2016/5/10/chartex" xmlns:cx5="http://schemas.microsoft.com/office/drawing/2016/5/11/chartex" xmlns:cx6="http://schemas.microsoft.com/office/drawing/2016/5/12/chartex" xmlns:cx7="http://schemas.microsoft.com/office/drawing/2016/5/13/chartex" xmlns:cx8="http://schemas.microsoft.com/office/drawing/2016/5/14/chartex" xmlns:mc="http://schemas.openxmlformats.org/markup-compatibility/2006" xmlns:aink="http://schemas.microsoft.com/office/drawing/2016/ink" xmlns:am3d="http://schemas.microsoft.com/office/drawing/2017/model3d" xmlns:o="urn:schemas-microsoft-com:office:office" xmlns:oel="http://schemas.microsoft.com/office/2019/extlst" xmlns:r="http://schemas.openxmlformats.org/officeDocument/2006/relationships" xmlns:m="http://schemas.openxmlformats.org/officeDocument/2006/math" xmlns:v="urn:schemas-microsoft-com:vml" xmlns:wp14="http://schemas.microsoft.com/office/word/2010/wordprocessingDrawing" xmlns:wp="http://schemas.openxmlformats.org/drawingml/2006/wordprocessingDrawing" xmlns:w10="urn:schemas-microsoft-com:office:word" xmlns:w="http://schemas.openxmlformats.org/wordprocessingml/2006/main" xmlns:w14="http://schemas.microsoft.com/office/word/2010/wordml" xmlns:w15="http://schemas.microsoft.com/office/word/2012/wordml" xmlns:w16cex="http://schemas.microsoft.com/office/word/2018/wordml/cex" xmlns:w16cid="http://schemas.microsoft.com/office/word/2016/wordml/cid" xmlns:w16="http://schemas.microsoft.com/office/word/2018/wordml" xmlns:w16sdtdh="http://schemas.microsoft.com/office/word/2020/wordml/sdtdatahash" xmlns:w16se="http://schemas.microsoft.com/office/word/2015/wordml/symex" xmlns:wpg="http://schemas.microsoft.com/office/word/2010/wordprocessingGroup" xmlns:wpi="http://schemas.microsoft.com/office/word/2010/wordprocessingInk" xmlns:wne="http://schemas.microsoft.com/office/word/2006/wordml" xmlns:wps="http://schemas.microsoft.com/office/word/2010/wordprocessingShape" mc:Ignorable="w14 w15 w16se w16cid w16 w16cex w16sdtdh wp14">
+<w:ftr xmlns:wpc="http://schemas.microsoft.com/office/word/2010/wordprocessingCanvas" xmlns:cx="http://schemas.microsoft.com/office/drawing/2014/chartex" xmlns:cx1="http://schemas.microsoft.com/office/drawing/2015/9/8/chartex" xmlns:cx2="http://schemas.microsoft.com/office/drawing/2015/10/21/chartex" xmlns:cx3="http://schemas.microsoft.com/office/drawing/2016/5/9/chartex" xmlns:cx4="http://schemas.microsoft.com/office/drawing/2016/5/10/chartex" xmlns:cx5="http://schemas.microsoft.com/office/drawing/2016/5/11/chartex" xmlns:cx6="http://schemas.microsoft.com/office/drawing/2016/5/12/chartex" xmlns:cx7="http://schemas.microsoft.com/office/drawing/2016/5/13/chartex" xmlns:cx8="http://schemas.microsoft.com/office/drawing/2016/5/14/chartex" xmlns:mc="http://schemas.openxmlformats.org/markup-compatibility/2006" xmlns:aink="http://schemas.microsoft.com/office/drawing/2016/ink" xmlns:am3d="http://schemas.microsoft.com/office/drawing/2017/model3d" xmlns:o="urn:schemas-microsoft-com:office:office" xmlns:oel="http://schemas.microsoft.com/office/2019/extlst" xmlns:r="http://schemas.openxmlformats.org/officeDocument/2006/relationships" xmlns:m="http://schemas.openxmlformats.org/officeDocument/2006/math" xmlns:v="urn:schemas-microsoft-com:vml" xmlns:wp14="http://schemas.microsoft.com/office/word/2010/wordprocessingDrawing" xmlns:wp="http://schemas.openxmlformats.org/drawingml/2006/wordprocessingDrawing" xmlns:w10="urn:schemas-microsoft-com:office:word" xmlns:w="http://schemas.openxmlformats.org/wordprocessingml/2006/main" xmlns:w14="http://schemas.microsoft.com/office/word/2010/wordml" xmlns:w15="http://schemas.microsoft.com/office/word/2012/wordml" xmlns:w16cex="http://schemas.microsoft.com/office/word/2018/wordml/cex" xmlns:w16cid="http://schemas.microsoft.com/office/word/2016/wordml/cid" xmlns:w16="http://schemas.microsoft.com/office/word/2018/wordml" xmlns:w16du="http://schemas.microsoft.com/office/word/2023/wordml/word16du" xmlns:w16sdtdh="http://schemas.microsoft.com/office/word/2020/wordml/sdtdatahash" xmlns:w16sdtfl="http://schemas.microsoft.com/office/word/2024/wordml/sdtformatlock" xmlns:w16se="http://schemas.microsoft.com/office/word/2015/wordml/symex" xmlns:wpg="http://schemas.microsoft.com/office/word/2010/wordprocessingGroup" xmlns:wpi="http://schemas.microsoft.com/office/word/2010/wordprocessingInk" xmlns:wne="http://schemas.microsoft.com/office/word/2006/wordml" xmlns:wps="http://schemas.microsoft.com/office/word/2010/wordprocessingShape" mc:Ignorable="w14 w15 w16se w16cid w16 w16cex w16sdtdh w16sdtfl w16du wp14">
   <w:p>
     <w:pPr>
       <w:pStyle w:val="Footer"/>
@@ -4741,13 +4853,13 @@
       <w:t>Version: 202</w:t>
     </w:r>
     <w:r>
-      <w:t>3</w:t>
+      <w:t>6</w:t>
     </w:r>
     <w:r>
       <w:t>-</w:t>
     </w:r>
     <w:r>
-      <w:t>10</w:t>
+      <w:t>05</w:t>
     </w:r>
     <w:r>
       <w:t>-</w:t>
@@ -4759,18 +4871,8 @@
 </w:ftr>
 </file>
 
-<file path=word/footer3.xml><?xml version="1.0" encoding="utf-8"?>
-<w:ftr xmlns:wpc="http://schemas.microsoft.com/office/word/2010/wordprocessingCanvas" xmlns:cx="http://schemas.microsoft.com/office/drawing/2014/chartex" xmlns:cx1="http://schemas.microsoft.com/office/drawing/2015/9/8/chartex" xmlns:cx2="http://schemas.microsoft.com/office/drawing/2015/10/21/chartex" xmlns:cx3="http://schemas.microsoft.com/office/drawing/2016/5/9/chartex" xmlns:cx4="http://schemas.microsoft.com/office/drawing/2016/5/10/chartex" xmlns:cx5="http://schemas.microsoft.com/office/drawing/2016/5/11/chartex" xmlns:cx6="http://schemas.microsoft.com/office/drawing/2016/5/12/chartex" xmlns:cx7="http://schemas.microsoft.com/office/drawing/2016/5/13/chartex" xmlns:cx8="http://schemas.microsoft.com/office/drawing/2016/5/14/chartex" xmlns:mc="http://schemas.openxmlformats.org/markup-compatibility/2006" xmlns:aink="http://schemas.microsoft.com/office/drawing/2016/ink" xmlns:am3d="http://schemas.microsoft.com/office/drawing/2017/model3d" xmlns:o="urn:schemas-microsoft-com:office:office" xmlns:oel="http://schemas.microsoft.com/office/2019/extlst" xmlns:r="http://schemas.openxmlformats.org/officeDocument/2006/relationships" xmlns:m="http://schemas.openxmlformats.org/officeDocument/2006/math" xmlns:v="urn:schemas-microsoft-com:vml" xmlns:wp14="http://schemas.microsoft.com/office/word/2010/wordprocessingDrawing" xmlns:wp="http://schemas.openxmlformats.org/drawingml/2006/wordprocessingDrawing" xmlns:w10="urn:schemas-microsoft-com:office:word" xmlns:w="http://schemas.openxmlformats.org/wordprocessingml/2006/main" xmlns:w14="http://schemas.microsoft.com/office/word/2010/wordml" xmlns:w15="http://schemas.microsoft.com/office/word/2012/wordml" xmlns:w16cex="http://schemas.microsoft.com/office/word/2018/wordml/cex" xmlns:w16cid="http://schemas.microsoft.com/office/word/2016/wordml/cid" xmlns:w16="http://schemas.microsoft.com/office/word/2018/wordml" xmlns:w16sdtdh="http://schemas.microsoft.com/office/word/2020/wordml/sdtdatahash" xmlns:w16se="http://schemas.microsoft.com/office/word/2015/wordml/symex" xmlns:wpg="http://schemas.microsoft.com/office/word/2010/wordprocessingGroup" xmlns:wpi="http://schemas.microsoft.com/office/word/2010/wordprocessingInk" xmlns:wne="http://schemas.microsoft.com/office/word/2006/wordml" xmlns:wps="http://schemas.microsoft.com/office/word/2010/wordprocessingShape" mc:Ignorable="w14 w15 w16se w16cid w16 w16cex w16sdtdh wp14">
-  <w:p>
-    <w:pPr>
-      <w:pStyle w:val="Footer"/>
-    </w:pPr>
-  </w:p>
-</w:ftr>
-</file>
-
 <file path=word/footnotes.xml><?xml version="1.0" encoding="utf-8"?>
-<w:footnotes xmlns:wpc="http://schemas.microsoft.com/office/word/2010/wordprocessingCanvas" xmlns:cx="http://schemas.microsoft.com/office/drawing/2014/chartex" xmlns:cx1="http://schemas.microsoft.com/office/drawing/2015/9/8/chartex" xmlns:cx2="http://schemas.microsoft.com/office/drawing/2015/10/21/chartex" xmlns:cx3="http://schemas.microsoft.com/office/drawing/2016/5/9/chartex" xmlns:cx4="http://schemas.microsoft.com/office/drawing/2016/5/10/chartex" xmlns:cx5="http://schemas.microsoft.com/office/drawing/2016/5/11/chartex" xmlns:cx6="http://schemas.microsoft.com/office/drawing/2016/5/12/chartex" xmlns:cx7="http://schemas.microsoft.com/office/drawing/2016/5/13/chartex" xmlns:cx8="http://schemas.microsoft.com/office/drawing/2016/5/14/chartex" xmlns:mc="http://schemas.openxmlformats.org/markup-compatibility/2006" xmlns:aink="http://schemas.microsoft.com/office/drawing/2016/ink" xmlns:am3d="http://schemas.microsoft.com/office/drawing/2017/model3d" xmlns:o="urn:schemas-microsoft-com:office:office" xmlns:oel="http://schemas.microsoft.com/office/2019/extlst" xmlns:r="http://schemas.openxmlformats.org/officeDocument/2006/relationships" xmlns:m="http://schemas.openxmlformats.org/officeDocument/2006/math" xmlns:v="urn:schemas-microsoft-com:vml" xmlns:wp14="http://schemas.microsoft.com/office/word/2010/wordprocessingDrawing" xmlns:wp="http://schemas.openxmlformats.org/drawingml/2006/wordprocessingDrawing" xmlns:w10="urn:schemas-microsoft-com:office:word" xmlns:w="http://schemas.openxmlformats.org/wordprocessingml/2006/main" xmlns:w14="http://schemas.microsoft.com/office/word/2010/wordml" xmlns:w15="http://schemas.microsoft.com/office/word/2012/wordml" xmlns:w16cex="http://schemas.microsoft.com/office/word/2018/wordml/cex" xmlns:w16cid="http://schemas.microsoft.com/office/word/2016/wordml/cid" xmlns:w16="http://schemas.microsoft.com/office/word/2018/wordml" xmlns:w16sdtdh="http://schemas.microsoft.com/office/word/2020/wordml/sdtdatahash" xmlns:w16se="http://schemas.microsoft.com/office/word/2015/wordml/symex" xmlns:wpg="http://schemas.microsoft.com/office/word/2010/wordprocessingGroup" xmlns:wpi="http://schemas.microsoft.com/office/word/2010/wordprocessingInk" xmlns:wne="http://schemas.microsoft.com/office/word/2006/wordml" xmlns:wps="http://schemas.microsoft.com/office/word/2010/wordprocessingShape" mc:Ignorable="w14 w15 w16se w16cid w16 w16cex w16sdtdh wp14">
+<w:footnotes xmlns:wpc="http://schemas.microsoft.com/office/word/2010/wordprocessingCanvas" xmlns:cx="http://schemas.microsoft.com/office/drawing/2014/chartex" xmlns:cx1="http://schemas.microsoft.com/office/drawing/2015/9/8/chartex" xmlns:cx2="http://schemas.microsoft.com/office/drawing/2015/10/21/chartex" xmlns:cx3="http://schemas.microsoft.com/office/drawing/2016/5/9/chartex" xmlns:cx4="http://schemas.microsoft.com/office/drawing/2016/5/10/chartex" xmlns:cx5="http://schemas.microsoft.com/office/drawing/2016/5/11/chartex" xmlns:cx6="http://schemas.microsoft.com/office/drawing/2016/5/12/chartex" xmlns:cx7="http://schemas.microsoft.com/office/drawing/2016/5/13/chartex" xmlns:cx8="http://schemas.microsoft.com/office/drawing/2016/5/14/chartex" xmlns:mc="http://schemas.openxmlformats.org/markup-compatibility/2006" xmlns:aink="http://schemas.microsoft.com/office/drawing/2016/ink" xmlns:am3d="http://schemas.microsoft.com/office/drawing/2017/model3d" xmlns:o="urn:schemas-microsoft-com:office:office" xmlns:oel="http://schemas.microsoft.com/office/2019/extlst" xmlns:r="http://schemas.openxmlformats.org/officeDocument/2006/relationships" xmlns:m="http://schemas.openxmlformats.org/officeDocument/2006/math" xmlns:v="urn:schemas-microsoft-com:vml" xmlns:wp14="http://schemas.microsoft.com/office/word/2010/wordprocessingDrawing" xmlns:wp="http://schemas.openxmlformats.org/drawingml/2006/wordprocessingDrawing" xmlns:w10="urn:schemas-microsoft-com:office:word" xmlns:w="http://schemas.openxmlformats.org/wordprocessingml/2006/main" xmlns:w14="http://schemas.microsoft.com/office/word/2010/wordml" xmlns:w15="http://schemas.microsoft.com/office/word/2012/wordml" xmlns:w16cex="http://schemas.microsoft.com/office/word/2018/wordml/cex" xmlns:w16cid="http://schemas.microsoft.com/office/word/2016/wordml/cid" xmlns:w16="http://schemas.microsoft.com/office/word/2018/wordml" xmlns:w16du="http://schemas.microsoft.com/office/word/2023/wordml/word16du" xmlns:w16sdtdh="http://schemas.microsoft.com/office/word/2020/wordml/sdtdatahash" xmlns:w16sdtfl="http://schemas.microsoft.com/office/word/2024/wordml/sdtformatlock" xmlns:w16se="http://schemas.microsoft.com/office/word/2015/wordml/symex" xmlns:wpg="http://schemas.microsoft.com/office/word/2010/wordprocessingGroup" xmlns:wpi="http://schemas.microsoft.com/office/word/2010/wordprocessingInk" xmlns:wne="http://schemas.microsoft.com/office/word/2006/wordml" xmlns:wps="http://schemas.microsoft.com/office/word/2010/wordprocessingShape" mc:Ignorable="w14 w15 w16se w16cid w16 w16cex w16sdtdh w16sdtfl w16du wp14">
   <w:footnote w:type="separator" w:id="-1">
     <w:p>
       <w:pPr>
@@ -4795,17 +4897,7 @@
 </file>
 
 <file path=word/header1.xml><?xml version="1.0" encoding="utf-8"?>
-<w:hdr xmlns:wpc="http://schemas.microsoft.com/office/word/2010/wordprocessingCanvas" xmlns:cx="http://schemas.microsoft.com/office/drawing/2014/chartex" xmlns:cx1="http://schemas.microsoft.com/office/drawing/2015/9/8/chartex" xmlns:cx2="http://schemas.microsoft.com/office/drawing/2015/10/21/chartex" xmlns:cx3="http://schemas.microsoft.com/office/drawing/2016/5/9/chartex" xmlns:cx4="http://schemas.microsoft.com/office/drawing/2016/5/10/chartex" xmlns:cx5="http://schemas.microsoft.com/office/drawing/2016/5/11/chartex" xmlns:cx6="http://schemas.microsoft.com/office/drawing/2016/5/12/chartex" xmlns:cx7="http://schemas.microsoft.com/office/drawing/2016/5/13/chartex" xmlns:cx8="http://schemas.microsoft.com/office/drawing/2016/5/14/chartex" xmlns:mc="http://schemas.openxmlformats.org/markup-compatibility/2006" xmlns:aink="http://schemas.microsoft.com/office/drawing/2016/ink" xmlns:am3d="http://schemas.microsoft.com/office/drawing/2017/model3d" xmlns:o="urn:schemas-microsoft-com:office:office" xmlns:oel="http://schemas.microsoft.com/office/2019/extlst" xmlns:r="http://schemas.openxmlformats.org/officeDocument/2006/relationships" xmlns:m="http://schemas.openxmlformats.org/officeDocument/2006/math" xmlns:v="urn:schemas-microsoft-com:vml" xmlns:wp14="http://schemas.microsoft.com/office/word/2010/wordprocessingDrawing" xmlns:wp="http://schemas.openxmlformats.org/drawingml/2006/wordprocessingDrawing" xmlns:w10="urn:schemas-microsoft-com:office:word" xmlns:w="http://schemas.openxmlformats.org/wordprocessingml/2006/main" xmlns:w14="http://schemas.microsoft.com/office/word/2010/wordml" xmlns:w15="http://schemas.microsoft.com/office/word/2012/wordml" xmlns:w16cex="http://schemas.microsoft.com/office/word/2018/wordml/cex" xmlns:w16cid="http://schemas.microsoft.com/office/word/2016/wordml/cid" xmlns:w16="http://schemas.microsoft.com/office/word/2018/wordml" xmlns:w16sdtdh="http://schemas.microsoft.com/office/word/2020/wordml/sdtdatahash" xmlns:w16se="http://schemas.microsoft.com/office/word/2015/wordml/symex" xmlns:wpg="http://schemas.microsoft.com/office/word/2010/wordprocessingGroup" xmlns:wpi="http://schemas.microsoft.com/office/word/2010/wordprocessingInk" xmlns:wne="http://schemas.microsoft.com/office/word/2006/wordml" xmlns:wps="http://schemas.microsoft.com/office/word/2010/wordprocessingShape" mc:Ignorable="w14 w15 w16se w16cid w16 w16cex w16sdtdh wp14">
-  <w:p>
-    <w:pPr>
-      <w:pStyle w:val="Header"/>
-    </w:pPr>
-  </w:p>
-</w:hdr>
-</file>
-
-<file path=word/header2.xml><?xml version="1.0" encoding="utf-8"?>
-<w:hdr xmlns:wpc="http://schemas.microsoft.com/office/word/2010/wordprocessingCanvas" xmlns:cx="http://schemas.microsoft.com/office/drawing/2014/chartex" xmlns:cx1="http://schemas.microsoft.com/office/drawing/2015/9/8/chartex" xmlns:cx2="http://schemas.microsoft.com/office/drawing/2015/10/21/chartex" xmlns:cx3="http://schemas.microsoft.com/office/drawing/2016/5/9/chartex" xmlns:cx4="http://schemas.microsoft.com/office/drawing/2016/5/10/chartex" xmlns:cx5="http://schemas.microsoft.com/office/drawing/2016/5/11/chartex" xmlns:cx6="http://schemas.microsoft.com/office/drawing/2016/5/12/chartex" xmlns:cx7="http://schemas.microsoft.com/office/drawing/2016/5/13/chartex" xmlns:cx8="http://schemas.microsoft.com/office/drawing/2016/5/14/chartex" xmlns:mc="http://schemas.openxmlformats.org/markup-compatibility/2006" xmlns:aink="http://schemas.microsoft.com/office/drawing/2016/ink" xmlns:am3d="http://schemas.microsoft.com/office/drawing/2017/model3d" xmlns:o="urn:schemas-microsoft-com:office:office" xmlns:oel="http://schemas.microsoft.com/office/2019/extlst" xmlns:r="http://schemas.openxmlformats.org/officeDocument/2006/relationships" xmlns:m="http://schemas.openxmlformats.org/officeDocument/2006/math" xmlns:v="urn:schemas-microsoft-com:vml" xmlns:wp14="http://schemas.microsoft.com/office/word/2010/wordprocessingDrawing" xmlns:wp="http://schemas.openxmlformats.org/drawingml/2006/wordprocessingDrawing" xmlns:w10="urn:schemas-microsoft-com:office:word" xmlns:w="http://schemas.openxmlformats.org/wordprocessingml/2006/main" xmlns:w14="http://schemas.microsoft.com/office/word/2010/wordml" xmlns:w15="http://schemas.microsoft.com/office/word/2012/wordml" xmlns:w16cex="http://schemas.microsoft.com/office/word/2018/wordml/cex" xmlns:w16cid="http://schemas.microsoft.com/office/word/2016/wordml/cid" xmlns:w16="http://schemas.microsoft.com/office/word/2018/wordml" xmlns:w16sdtdh="http://schemas.microsoft.com/office/word/2020/wordml/sdtdatahash" xmlns:w16se="http://schemas.microsoft.com/office/word/2015/wordml/symex" xmlns:wpg="http://schemas.microsoft.com/office/word/2010/wordprocessingGroup" xmlns:wpi="http://schemas.microsoft.com/office/word/2010/wordprocessingInk" xmlns:wne="http://schemas.microsoft.com/office/word/2006/wordml" xmlns:wps="http://schemas.microsoft.com/office/word/2010/wordprocessingShape" mc:Ignorable="w14 w15 w16se w16cid w16 w16cex w16sdtdh wp14">
+<w:hdr xmlns:wpc="http://schemas.microsoft.com/office/word/2010/wordprocessingCanvas" xmlns:cx="http://schemas.microsoft.com/office/drawing/2014/chartex" xmlns:cx1="http://schemas.microsoft.com/office/drawing/2015/9/8/chartex" xmlns:cx2="http://schemas.microsoft.com/office/drawing/2015/10/21/chartex" xmlns:cx3="http://schemas.microsoft.com/office/drawing/2016/5/9/chartex" xmlns:cx4="http://schemas.microsoft.com/office/drawing/2016/5/10/chartex" xmlns:cx5="http://schemas.microsoft.com/office/drawing/2016/5/11/chartex" xmlns:cx6="http://schemas.microsoft.com/office/drawing/2016/5/12/chartex" xmlns:cx7="http://schemas.microsoft.com/office/drawing/2016/5/13/chartex" xmlns:cx8="http://schemas.microsoft.com/office/drawing/2016/5/14/chartex" xmlns:mc="http://schemas.openxmlformats.org/markup-compatibility/2006" xmlns:aink="http://schemas.microsoft.com/office/drawing/2016/ink" xmlns:am3d="http://schemas.microsoft.com/office/drawing/2017/model3d" xmlns:o="urn:schemas-microsoft-com:office:office" xmlns:oel="http://schemas.microsoft.com/office/2019/extlst" xmlns:r="http://schemas.openxmlformats.org/officeDocument/2006/relationships" xmlns:m="http://schemas.openxmlformats.org/officeDocument/2006/math" xmlns:v="urn:schemas-microsoft-com:vml" xmlns:wp14="http://schemas.microsoft.com/office/word/2010/wordprocessingDrawing" xmlns:wp="http://schemas.openxmlformats.org/drawingml/2006/wordprocessingDrawing" xmlns:w10="urn:schemas-microsoft-com:office:word" xmlns:w="http://schemas.openxmlformats.org/wordprocessingml/2006/main" xmlns:w14="http://schemas.microsoft.com/office/word/2010/wordml" xmlns:w15="http://schemas.microsoft.com/office/word/2012/wordml" xmlns:w16cex="http://schemas.microsoft.com/office/word/2018/wordml/cex" xmlns:w16cid="http://schemas.microsoft.com/office/word/2016/wordml/cid" xmlns:w16="http://schemas.microsoft.com/office/word/2018/wordml" xmlns:w16du="http://schemas.microsoft.com/office/word/2023/wordml/word16du" xmlns:w16sdtdh="http://schemas.microsoft.com/office/word/2020/wordml/sdtdatahash" xmlns:w16sdtfl="http://schemas.microsoft.com/office/word/2024/wordml/sdtformatlock" xmlns:w16se="http://schemas.microsoft.com/office/word/2015/wordml/symex" xmlns:wpg="http://schemas.microsoft.com/office/word/2010/wordprocessingGroup" xmlns:wpi="http://schemas.microsoft.com/office/word/2010/wordprocessingInk" xmlns:wne="http://schemas.microsoft.com/office/word/2006/wordml" xmlns:wps="http://schemas.microsoft.com/office/word/2010/wordprocessingShape" mc:Ignorable="w14 w15 w16se w16cid w16 w16cex w16sdtdh w16sdtfl w16du wp14">
   <w:p>
     <w:pPr>
       <w:pStyle w:val="Header"/>
@@ -4843,18 +4935,8 @@
 </w:hdr>
 </file>
 
-<file path=word/header3.xml><?xml version="1.0" encoding="utf-8"?>
-<w:hdr xmlns:wpc="http://schemas.microsoft.com/office/word/2010/wordprocessingCanvas" xmlns:cx="http://schemas.microsoft.com/office/drawing/2014/chartex" xmlns:cx1="http://schemas.microsoft.com/office/drawing/2015/9/8/chartex" xmlns:cx2="http://schemas.microsoft.com/office/drawing/2015/10/21/chartex" xmlns:cx3="http://schemas.microsoft.com/office/drawing/2016/5/9/chartex" xmlns:cx4="http://schemas.microsoft.com/office/drawing/2016/5/10/chartex" xmlns:cx5="http://schemas.microsoft.com/office/drawing/2016/5/11/chartex" xmlns:cx6="http://schemas.microsoft.com/office/drawing/2016/5/12/chartex" xmlns:cx7="http://schemas.microsoft.com/office/drawing/2016/5/13/chartex" xmlns:cx8="http://schemas.microsoft.com/office/drawing/2016/5/14/chartex" xmlns:mc="http://schemas.openxmlformats.org/markup-compatibility/2006" xmlns:aink="http://schemas.microsoft.com/office/drawing/2016/ink" xmlns:am3d="http://schemas.microsoft.com/office/drawing/2017/model3d" xmlns:o="urn:schemas-microsoft-com:office:office" xmlns:oel="http://schemas.microsoft.com/office/2019/extlst" xmlns:r="http://schemas.openxmlformats.org/officeDocument/2006/relationships" xmlns:m="http://schemas.openxmlformats.org/officeDocument/2006/math" xmlns:v="urn:schemas-microsoft-com:vml" xmlns:wp14="http://schemas.microsoft.com/office/word/2010/wordprocessingDrawing" xmlns:wp="http://schemas.openxmlformats.org/drawingml/2006/wordprocessingDrawing" xmlns:w10="urn:schemas-microsoft-com:office:word" xmlns:w="http://schemas.openxmlformats.org/wordprocessingml/2006/main" xmlns:w14="http://schemas.microsoft.com/office/word/2010/wordml" xmlns:w15="http://schemas.microsoft.com/office/word/2012/wordml" xmlns:w16cex="http://schemas.microsoft.com/office/word/2018/wordml/cex" xmlns:w16cid="http://schemas.microsoft.com/office/word/2016/wordml/cid" xmlns:w16="http://schemas.microsoft.com/office/word/2018/wordml" xmlns:w16sdtdh="http://schemas.microsoft.com/office/word/2020/wordml/sdtdatahash" xmlns:w16se="http://schemas.microsoft.com/office/word/2015/wordml/symex" xmlns:wpg="http://schemas.microsoft.com/office/word/2010/wordprocessingGroup" xmlns:wpi="http://schemas.microsoft.com/office/word/2010/wordprocessingInk" xmlns:wne="http://schemas.microsoft.com/office/word/2006/wordml" xmlns:wps="http://schemas.microsoft.com/office/word/2010/wordprocessingShape" mc:Ignorable="w14 w15 w16se w16cid w16 w16cex w16sdtdh wp14">
-  <w:p>
-    <w:pPr>
-      <w:pStyle w:val="Header"/>
-    </w:pPr>
-  </w:p>
-</w:hdr>
-</file>
-
 <file path=word/numbering.xml><?xml version="1.0" encoding="utf-8"?>
-<w:numbering xmlns:wpc="http://schemas.microsoft.com/office/word/2010/wordprocessingCanvas" xmlns:cx="http://schemas.microsoft.com/office/drawing/2014/chartex" xmlns:cx1="http://schemas.microsoft.com/office/drawing/2015/9/8/chartex" xmlns:cx2="http://schemas.microsoft.com/office/drawing/2015/10/21/chartex" xmlns:cx3="http://schemas.microsoft.com/office/drawing/2016/5/9/chartex" xmlns:cx4="http://schemas.microsoft.com/office/drawing/2016/5/10/chartex" xmlns:cx5="http://schemas.microsoft.com/office/drawing/2016/5/11/chartex" xmlns:cx6="http://schemas.microsoft.com/office/drawing/2016/5/12/chartex" xmlns:cx7="http://schemas.microsoft.com/office/drawing/2016/5/13/chartex" xmlns:cx8="http://schemas.microsoft.com/office/drawing/2016/5/14/chartex" xmlns:mc="http://schemas.openxmlformats.org/markup-compatibility/2006" xmlns:aink="http://schemas.microsoft.com/office/drawing/2016/ink" xmlns:am3d="http://schemas.microsoft.com/office/drawing/2017/model3d" xmlns:o="urn:schemas-microsoft-com:office:office" xmlns:oel="http://schemas.microsoft.com/office/2019/extlst" xmlns:r="http://schemas.openxmlformats.org/officeDocument/2006/relationships" xmlns:m="http://schemas.openxmlformats.org/officeDocument/2006/math" xmlns:v="urn:schemas-microsoft-com:vml" xmlns:wp14="http://schemas.microsoft.com/office/word/2010/wordprocessingDrawing" xmlns:wp="http://schemas.openxmlformats.org/drawingml/2006/wordprocessingDrawing" xmlns:w10="urn:schemas-microsoft-com:office:word" xmlns:w="http://schemas.openxmlformats.org/wordprocessingml/2006/main" xmlns:w14="http://schemas.microsoft.com/office/word/2010/wordml" xmlns:w15="http://schemas.microsoft.com/office/word/2012/wordml" xmlns:w16cex="http://schemas.microsoft.com/office/word/2018/wordml/cex" xmlns:w16cid="http://schemas.microsoft.com/office/word/2016/wordml/cid" xmlns:w16="http://schemas.microsoft.com/office/word/2018/wordml" xmlns:w16sdtdh="http://schemas.microsoft.com/office/word/2020/wordml/sdtdatahash" xmlns:w16se="http://schemas.microsoft.com/office/word/2015/wordml/symex" xmlns:wpg="http://schemas.microsoft.com/office/word/2010/wordprocessingGroup" xmlns:wpi="http://schemas.microsoft.com/office/word/2010/wordprocessingInk" xmlns:wne="http://schemas.microsoft.com/office/word/2006/wordml" xmlns:wps="http://schemas.microsoft.com/office/word/2010/wordprocessingShape" mc:Ignorable="w14 w15 w16se w16cid w16 w16cex w16sdtdh wp14">
+<w:numbering xmlns:wpc="http://schemas.microsoft.com/office/word/2010/wordprocessingCanvas" xmlns:cx="http://schemas.microsoft.com/office/drawing/2014/chartex" xmlns:cx1="http://schemas.microsoft.com/office/drawing/2015/9/8/chartex" xmlns:cx2="http://schemas.microsoft.com/office/drawing/2015/10/21/chartex" xmlns:cx3="http://schemas.microsoft.com/office/drawing/2016/5/9/chartex" xmlns:cx4="http://schemas.microsoft.com/office/drawing/2016/5/10/chartex" xmlns:cx5="http://schemas.microsoft.com/office/drawing/2016/5/11/chartex" xmlns:cx6="http://schemas.microsoft.com/office/drawing/2016/5/12/chartex" xmlns:cx7="http://schemas.microsoft.com/office/drawing/2016/5/13/chartex" xmlns:cx8="http://schemas.microsoft.com/office/drawing/2016/5/14/chartex" xmlns:mc="http://schemas.openxmlformats.org/markup-compatibility/2006" xmlns:aink="http://schemas.microsoft.com/office/drawing/2016/ink" xmlns:am3d="http://schemas.microsoft.com/office/drawing/2017/model3d" xmlns:o="urn:schemas-microsoft-com:office:office" xmlns:oel="http://schemas.microsoft.com/office/2019/extlst" xmlns:r="http://schemas.openxmlformats.org/officeDocument/2006/relationships" xmlns:m="http://schemas.openxmlformats.org/officeDocument/2006/math" xmlns:v="urn:schemas-microsoft-com:vml" xmlns:wp14="http://schemas.microsoft.com/office/word/2010/wordprocessingDrawing" xmlns:wp="http://schemas.openxmlformats.org/drawingml/2006/wordprocessingDrawing" xmlns:w10="urn:schemas-microsoft-com:office:word" xmlns:w="http://schemas.openxmlformats.org/wordprocessingml/2006/main" xmlns:w14="http://schemas.microsoft.com/office/word/2010/wordml" xmlns:w15="http://schemas.microsoft.com/office/word/2012/wordml" xmlns:w16cex="http://schemas.microsoft.com/office/word/2018/wordml/cex" xmlns:w16cid="http://schemas.microsoft.com/office/word/2016/wordml/cid" xmlns:w16="http://schemas.microsoft.com/office/word/2018/wordml" xmlns:w16du="http://schemas.microsoft.com/office/word/2023/wordml/word16du" xmlns:w16sdtdh="http://schemas.microsoft.com/office/word/2020/wordml/sdtdatahash" xmlns:w16sdtfl="http://schemas.microsoft.com/office/word/2024/wordml/sdtformatlock" xmlns:w16se="http://schemas.microsoft.com/office/word/2015/wordml/symex" xmlns:wpg="http://schemas.microsoft.com/office/word/2010/wordprocessingGroup" xmlns:wpi="http://schemas.microsoft.com/office/word/2010/wordprocessingInk" xmlns:wne="http://schemas.microsoft.com/office/word/2006/wordml" xmlns:wps="http://schemas.microsoft.com/office/word/2010/wordprocessingShape" mc:Ignorable="w14 w15 w16se w16cid w16 w16cex w16sdtdh w16sdtfl w16du wp14">
   <w:abstractNum w:abstractNumId="0" w15:restartNumberingAfterBreak="0">
     <w:nsid w:val="2FD94E89"/>
     <w:multiLevelType w:val="hybridMultilevel"/>
@@ -4975,7 +5057,7 @@
 </file>
 
 <file path=word/people.xml><?xml version="1.0" encoding="utf-8"?>
-<w15:people xmlns:wpc="http://schemas.microsoft.com/office/word/2010/wordprocessingCanvas" xmlns:cx="http://schemas.microsoft.com/office/drawing/2014/chartex" xmlns:cx1="http://schemas.microsoft.com/office/drawing/2015/9/8/chartex" xmlns:cx2="http://schemas.microsoft.com/office/drawing/2015/10/21/chartex" xmlns:cx3="http://schemas.microsoft.com/office/drawing/2016/5/9/chartex" xmlns:cx4="http://schemas.microsoft.com/office/drawing/2016/5/10/chartex" xmlns:cx5="http://schemas.microsoft.com/office/drawing/2016/5/11/chartex" xmlns:cx6="http://schemas.microsoft.com/office/drawing/2016/5/12/chartex" xmlns:cx7="http://schemas.microsoft.com/office/drawing/2016/5/13/chartex" xmlns:cx8="http://schemas.microsoft.com/office/drawing/2016/5/14/chartex" xmlns:mc="http://schemas.openxmlformats.org/markup-compatibility/2006" xmlns:aink="http://schemas.microsoft.com/office/drawing/2016/ink" xmlns:am3d="http://schemas.microsoft.com/office/drawing/2017/model3d" xmlns:o="urn:schemas-microsoft-com:office:office" xmlns:oel="http://schemas.microsoft.com/office/2019/extlst" xmlns:r="http://schemas.openxmlformats.org/officeDocument/2006/relationships" xmlns:m="http://schemas.openxmlformats.org/officeDocument/2006/math" xmlns:v="urn:schemas-microsoft-com:vml" xmlns:wp14="http://schemas.microsoft.com/office/word/2010/wordprocessingDrawing" xmlns:wp="http://schemas.openxmlformats.org/drawingml/2006/wordprocessingDrawing" xmlns:w10="urn:schemas-microsoft-com:office:word" xmlns:w="http://schemas.openxmlformats.org/wordprocessingml/2006/main" xmlns:w14="http://schemas.microsoft.com/office/word/2010/wordml" xmlns:w15="http://schemas.microsoft.com/office/word/2012/wordml" xmlns:w16cex="http://schemas.microsoft.com/office/word/2018/wordml/cex" xmlns:w16cid="http://schemas.microsoft.com/office/word/2016/wordml/cid" xmlns:w16="http://schemas.microsoft.com/office/word/2018/wordml" xmlns:w16sdtdh="http://schemas.microsoft.com/office/word/2020/wordml/sdtdatahash" xmlns:w16se="http://schemas.microsoft.com/office/word/2015/wordml/symex" xmlns:wpg="http://schemas.microsoft.com/office/word/2010/wordprocessingGroup" xmlns:wpi="http://schemas.microsoft.com/office/word/2010/wordprocessingInk" xmlns:wne="http://schemas.microsoft.com/office/word/2006/wordml" xmlns:wps="http://schemas.microsoft.com/office/word/2010/wordprocessingShape" mc:Ignorable="w14 w15 w16se w16cid w16 w16cex w16sdtdh wp14">
+<w15:people xmlns:wpc="http://schemas.microsoft.com/office/word/2010/wordprocessingCanvas" xmlns:cx="http://schemas.microsoft.com/office/drawing/2014/chartex" xmlns:cx1="http://schemas.microsoft.com/office/drawing/2015/9/8/chartex" xmlns:cx2="http://schemas.microsoft.com/office/drawing/2015/10/21/chartex" xmlns:cx3="http://schemas.microsoft.com/office/drawing/2016/5/9/chartex" xmlns:cx4="http://schemas.microsoft.com/office/drawing/2016/5/10/chartex" xmlns:cx5="http://schemas.microsoft.com/office/drawing/2016/5/11/chartex" xmlns:cx6="http://schemas.microsoft.com/office/drawing/2016/5/12/chartex" xmlns:cx7="http://schemas.microsoft.com/office/drawing/2016/5/13/chartex" xmlns:cx8="http://schemas.microsoft.com/office/drawing/2016/5/14/chartex" xmlns:mc="http://schemas.openxmlformats.org/markup-compatibility/2006" xmlns:aink="http://schemas.microsoft.com/office/drawing/2016/ink" xmlns:am3d="http://schemas.microsoft.com/office/drawing/2017/model3d" xmlns:o="urn:schemas-microsoft-com:office:office" xmlns:oel="http://schemas.microsoft.com/office/2019/extlst" xmlns:r="http://schemas.openxmlformats.org/officeDocument/2006/relationships" xmlns:m="http://schemas.openxmlformats.org/officeDocument/2006/math" xmlns:v="urn:schemas-microsoft-com:vml" xmlns:wp14="http://schemas.microsoft.com/office/word/2010/wordprocessingDrawing" xmlns:wp="http://schemas.openxmlformats.org/drawingml/2006/wordprocessingDrawing" xmlns:w10="urn:schemas-microsoft-com:office:word" xmlns:w="http://schemas.openxmlformats.org/wordprocessingml/2006/main" xmlns:w14="http://schemas.microsoft.com/office/word/2010/wordml" xmlns:w15="http://schemas.microsoft.com/office/word/2012/wordml" xmlns:w16cex="http://schemas.microsoft.com/office/word/2018/wordml/cex" xmlns:w16cid="http://schemas.microsoft.com/office/word/2016/wordml/cid" xmlns:w16="http://schemas.microsoft.com/office/word/2018/wordml" xmlns:w16du="http://schemas.microsoft.com/office/word/2023/wordml/word16du" xmlns:w16sdtdh="http://schemas.microsoft.com/office/word/2020/wordml/sdtdatahash" xmlns:w16sdtfl="http://schemas.microsoft.com/office/word/2024/wordml/sdtformatlock" xmlns:w16se="http://schemas.microsoft.com/office/word/2015/wordml/symex" xmlns:wpg="http://schemas.microsoft.com/office/word/2010/wordprocessingGroup" xmlns:wpi="http://schemas.microsoft.com/office/word/2010/wordprocessingInk" xmlns:wne="http://schemas.microsoft.com/office/word/2006/wordml" xmlns:wps="http://schemas.microsoft.com/office/word/2010/wordprocessingShape" mc:Ignorable="w14 w15 w16se w16cid w16 w16cex w16sdtdh w16sdtfl w16du wp14">
   <w15:person w15:author="Author">
     <w15:presenceInfo w15:providerId="None" w15:userId="Author"/>
   </w15:person>
@@ -4983,7 +5065,7 @@
 </file>
 
 <file path=word/styles.xml><?xml version="1.0" encoding="utf-8"?>
-<w:styles xmlns:mc="http://schemas.openxmlformats.org/markup-compatibility/2006" xmlns:r="http://schemas.openxmlformats.org/officeDocument/2006/relationships" xmlns:w="http://schemas.openxmlformats.org/wordprocessingml/2006/main" xmlns:w14="http://schemas.microsoft.com/office/word/2010/wordml" xmlns:w15="http://schemas.microsoft.com/office/word/2012/wordml" xmlns:w16cex="http://schemas.microsoft.com/office/word/2018/wordml/cex" xmlns:w16cid="http://schemas.microsoft.com/office/word/2016/wordml/cid" xmlns:w16="http://schemas.microsoft.com/office/word/2018/wordml" xmlns:w16sdtdh="http://schemas.microsoft.com/office/word/2020/wordml/sdtdatahash" xmlns:w16se="http://schemas.microsoft.com/office/word/2015/wordml/symex" mc:Ignorable="w14 w15 w16se w16cid w16 w16cex w16sdtdh">
+<w:styles xmlns:mc="http://schemas.openxmlformats.org/markup-compatibility/2006" xmlns:r="http://schemas.openxmlformats.org/officeDocument/2006/relationships" xmlns:w="http://schemas.openxmlformats.org/wordprocessingml/2006/main" xmlns:w14="http://schemas.microsoft.com/office/word/2010/wordml" xmlns:w15="http://schemas.microsoft.com/office/word/2012/wordml" xmlns:w16cex="http://schemas.microsoft.com/office/word/2018/wordml/cex" xmlns:w16cid="http://schemas.microsoft.com/office/word/2016/wordml/cid" xmlns:w16="http://schemas.microsoft.com/office/word/2018/wordml" xmlns:w16du="http://schemas.microsoft.com/office/word/2023/wordml/word16du" xmlns:w16sdtdh="http://schemas.microsoft.com/office/word/2020/wordml/sdtdatahash" xmlns:w16sdtfl="http://schemas.microsoft.com/office/word/2024/wordml/sdtformatlock" xmlns:w16se="http://schemas.microsoft.com/office/word/2015/wordml/symex" mc:Ignorable="w14 w15 w16se w16cid w16 w16cex w16sdtdh w16sdtfl w16du">
   <w:docDefaults>
     <w:rPrDefault>
       <w:rPr>
@@ -5723,11 +5805,36 @@
       <w:color w:val="808080"/>
     </w:rPr>
   </w:style>
+  <w:style w:type="paragraph" w:styleId="Revision">
+    <w:name w:val="Revision"/>
+    <w:hidden/>
+    <w:uiPriority w:val="99"/>
+    <w:semiHidden/>
+    <w:rsid w:val="00A04C8C"/>
+    <w:rPr>
+      <w:rFonts w:ascii="Arial" w:eastAsiaTheme="minorEastAsia" w:hAnsi="Arial" w:cs="Arial"/>
+      <w:sz w:val="22"/>
+      <w:szCs w:val="22"/>
+      <w:lang w:val="en" w:eastAsia="zh-CN"/>
+    </w:rPr>
+  </w:style>
+  <w:style w:type="character" w:styleId="UnresolvedMention">
+    <w:name w:val="Unresolved Mention"/>
+    <w:basedOn w:val="DefaultParagraphFont"/>
+    <w:uiPriority w:val="99"/>
+    <w:semiHidden/>
+    <w:unhideWhenUsed/>
+    <w:rsid w:val="00ED16EB"/>
+    <w:rPr>
+      <w:color w:val="605E5C"/>
+      <w:shd w:val="clear" w:color="auto" w:fill="E1DFDD"/>
+    </w:rPr>
+  </w:style>
 </w:styles>
 </file>
 
 <file path=word/glossary/document.xml><?xml version="1.0" encoding="utf-8"?>
-<w:glossaryDocument xmlns:wpc="http://schemas.microsoft.com/office/word/2010/wordprocessingCanvas" xmlns:cx="http://schemas.microsoft.com/office/drawing/2014/chartex" xmlns:cx1="http://schemas.microsoft.com/office/drawing/2015/9/8/chartex" xmlns:cx2="http://schemas.microsoft.com/office/drawing/2015/10/21/chartex" xmlns:cx3="http://schemas.microsoft.com/office/drawing/2016/5/9/chartex" xmlns:cx4="http://schemas.microsoft.com/office/drawing/2016/5/10/chartex" xmlns:cx5="http://schemas.microsoft.com/office/drawing/2016/5/11/chartex" xmlns:cx6="http://schemas.microsoft.com/office/drawing/2016/5/12/chartex" xmlns:cx7="http://schemas.microsoft.com/office/drawing/2016/5/13/chartex" xmlns:cx8="http://schemas.microsoft.com/office/drawing/2016/5/14/chartex" xmlns:mc="http://schemas.openxmlformats.org/markup-compatibility/2006" xmlns:aink="http://schemas.microsoft.com/office/drawing/2016/ink" xmlns:am3d="http://schemas.microsoft.com/office/drawing/2017/model3d" xmlns:o="urn:schemas-microsoft-com:office:office" xmlns:oel="http://schemas.microsoft.com/office/2019/extlst" xmlns:r="http://schemas.openxmlformats.org/officeDocument/2006/relationships" xmlns:m="http://schemas.openxmlformats.org/officeDocument/2006/math" xmlns:v="urn:schemas-microsoft-com:vml" xmlns:wp14="http://schemas.microsoft.com/office/word/2010/wordprocessingDrawing" xmlns:wp="http://schemas.openxmlformats.org/drawingml/2006/wordprocessingDrawing" xmlns:w10="urn:schemas-microsoft-com:office:word" xmlns:w="http://schemas.openxmlformats.org/wordprocessingml/2006/main" xmlns:w14="http://schemas.microsoft.com/office/word/2010/wordml" xmlns:w15="http://schemas.microsoft.com/office/word/2012/wordml" xmlns:w16cex="http://schemas.microsoft.com/office/word/2018/wordml/cex" xmlns:w16cid="http://schemas.microsoft.com/office/word/2016/wordml/cid" xmlns:w16="http://schemas.microsoft.com/office/word/2018/wordml" xmlns:w16sdtdh="http://schemas.microsoft.com/office/word/2020/wordml/sdtdatahash" xmlns:w16se="http://schemas.microsoft.com/office/word/2015/wordml/symex" xmlns:wpg="http://schemas.microsoft.com/office/word/2010/wordprocessingGroup" xmlns:wpi="http://schemas.microsoft.com/office/word/2010/wordprocessingInk" xmlns:wne="http://schemas.microsoft.com/office/word/2006/wordml" xmlns:wps="http://schemas.microsoft.com/office/word/2010/wordprocessingShape" mc:Ignorable="w14 w15 w16se w16cid w16 w16cex w16sdtdh wp14">
+<w:glossaryDocument xmlns:wpc="http://schemas.microsoft.com/office/word/2010/wordprocessingCanvas" xmlns:cx="http://schemas.microsoft.com/office/drawing/2014/chartex" xmlns:cx1="http://schemas.microsoft.com/office/drawing/2015/9/8/chartex" xmlns:cx2="http://schemas.microsoft.com/office/drawing/2015/10/21/chartex" xmlns:cx3="http://schemas.microsoft.com/office/drawing/2016/5/9/chartex" xmlns:cx4="http://schemas.microsoft.com/office/drawing/2016/5/10/chartex" xmlns:cx5="http://schemas.microsoft.com/office/drawing/2016/5/11/chartex" xmlns:cx6="http://schemas.microsoft.com/office/drawing/2016/5/12/chartex" xmlns:cx7="http://schemas.microsoft.com/office/drawing/2016/5/13/chartex" xmlns:cx8="http://schemas.microsoft.com/office/drawing/2016/5/14/chartex" xmlns:mc="http://schemas.openxmlformats.org/markup-compatibility/2006" xmlns:aink="http://schemas.microsoft.com/office/drawing/2016/ink" xmlns:am3d="http://schemas.microsoft.com/office/drawing/2017/model3d" xmlns:o="urn:schemas-microsoft-com:office:office" xmlns:oel="http://schemas.microsoft.com/office/2019/extlst" xmlns:r="http://schemas.openxmlformats.org/officeDocument/2006/relationships" xmlns:m="http://schemas.openxmlformats.org/officeDocument/2006/math" xmlns:v="urn:schemas-microsoft-com:vml" xmlns:wp14="http://schemas.microsoft.com/office/word/2010/wordprocessingDrawing" xmlns:wp="http://schemas.openxmlformats.org/drawingml/2006/wordprocessingDrawing" xmlns:w10="urn:schemas-microsoft-com:office:word" xmlns:w="http://schemas.openxmlformats.org/wordprocessingml/2006/main" xmlns:w14="http://schemas.microsoft.com/office/word/2010/wordml" xmlns:w15="http://schemas.microsoft.com/office/word/2012/wordml" xmlns:w16cex="http://schemas.microsoft.com/office/word/2018/wordml/cex" xmlns:w16cid="http://schemas.microsoft.com/office/word/2016/wordml/cid" xmlns:w16="http://schemas.microsoft.com/office/word/2018/wordml" xmlns:w16du="http://schemas.microsoft.com/office/word/2023/wordml/word16du" xmlns:w16sdtdh="http://schemas.microsoft.com/office/word/2020/wordml/sdtdatahash" xmlns:w16sdtfl="http://schemas.microsoft.com/office/word/2024/wordml/sdtformatlock" xmlns:w16se="http://schemas.microsoft.com/office/word/2015/wordml/symex" xmlns:wpg="http://schemas.microsoft.com/office/word/2010/wordprocessingGroup" xmlns:wpi="http://schemas.microsoft.com/office/word/2010/wordprocessingInk" xmlns:wne="http://schemas.microsoft.com/office/word/2006/wordml" xmlns:wps="http://schemas.microsoft.com/office/word/2010/wordprocessingShape" mc:Ignorable="w14 w15 w16se w16cid w16 w16cex w16sdtdh w16sdtfl w16du wp14">
   <w:docParts>
     <w:docPart>
       <w:docPartPr>
@@ -6314,7 +6421,7 @@
 </file>
 
 <file path=word/glossary/fontTable.xml><?xml version="1.0" encoding="utf-8"?>
-<w:fonts xmlns:mc="http://schemas.openxmlformats.org/markup-compatibility/2006" xmlns:r="http://schemas.openxmlformats.org/officeDocument/2006/relationships" xmlns:w="http://schemas.openxmlformats.org/wordprocessingml/2006/main" xmlns:w14="http://schemas.microsoft.com/office/word/2010/wordml" xmlns:w15="http://schemas.microsoft.com/office/word/2012/wordml" xmlns:w16cex="http://schemas.microsoft.com/office/word/2018/wordml/cex" xmlns:w16cid="http://schemas.microsoft.com/office/word/2016/wordml/cid" xmlns:w16="http://schemas.microsoft.com/office/word/2018/wordml" xmlns:w16sdtdh="http://schemas.microsoft.com/office/word/2020/wordml/sdtdatahash" xmlns:w16se="http://schemas.microsoft.com/office/word/2015/wordml/symex" mc:Ignorable="w14 w15 w16se w16cid w16 w16cex w16sdtdh">
+<w:fonts xmlns:mc="http://schemas.openxmlformats.org/markup-compatibility/2006" xmlns:r="http://schemas.openxmlformats.org/officeDocument/2006/relationships" xmlns:w="http://schemas.openxmlformats.org/wordprocessingml/2006/main" xmlns:w14="http://schemas.microsoft.com/office/word/2010/wordml" xmlns:w15="http://schemas.microsoft.com/office/word/2012/wordml" xmlns:w16cex="http://schemas.microsoft.com/office/word/2018/wordml/cex" xmlns:w16cid="http://schemas.microsoft.com/office/word/2016/wordml/cid" xmlns:w16="http://schemas.microsoft.com/office/word/2018/wordml" xmlns:w16du="http://schemas.microsoft.com/office/word/2023/wordml/word16du" xmlns:w16sdtdh="http://schemas.microsoft.com/office/word/2020/wordml/sdtdatahash" xmlns:w16sdtfl="http://schemas.microsoft.com/office/word/2024/wordml/sdtformatlock" xmlns:w16se="http://schemas.microsoft.com/office/word/2015/wordml/symex" mc:Ignorable="w14 w15 w16se w16cid w16 w16cex w16sdtdh w16sdtfl w16du">
   <w:font w:name="Symbol">
     <w:panose1 w:val="05050102010706020507"/>
     <w:charset w:val="02"/>
@@ -6356,7 +6463,7 @@
     <w:charset w:val="86"/>
     <w:family w:val="auto"/>
     <w:pitch w:val="variable"/>
-    <w:sig w:usb0="00000003" w:usb1="288F0000" w:usb2="00000016" w:usb3="00000000" w:csb0="00040001" w:csb1="00000000"/>
+    <w:sig w:usb0="00000203" w:usb1="288F0000" w:usb2="00000016" w:usb3="00000000" w:csb0="00040001" w:csb1="00000000"/>
   </w:font>
   <w:font w:name="Arial">
     <w:panose1 w:val="020B0604020202020204"/>
@@ -6380,11 +6487,25 @@
     <w:pitch w:val="variable"/>
     <w:sig w:usb0="E0002AFF" w:usb1="C000247B" w:usb2="00000009" w:usb3="00000000" w:csb0="000001FF" w:csb1="00000000"/>
   </w:font>
+  <w:font w:name="Aptos">
+    <w:panose1 w:val="020B0004020202020204"/>
+    <w:charset w:val="00"/>
+    <w:family w:val="swiss"/>
+    <w:pitch w:val="variable"/>
+    <w:sig w:usb0="20000287" w:usb1="00000003" w:usb2="00000000" w:usb3="00000000" w:csb0="0000019F" w:csb1="00000000"/>
+  </w:font>
+  <w:font w:name="Aptos Display">
+    <w:panose1 w:val="020B0004020202020204"/>
+    <w:charset w:val="00"/>
+    <w:family w:val="swiss"/>
+    <w:pitch w:val="variable"/>
+    <w:sig w:usb0="20000287" w:usb1="00000003" w:usb2="00000000" w:usb3="00000000" w:csb0="0000019F" w:csb1="00000000"/>
+  </w:font>
 </w:fonts>
 </file>
 
 <file path=word/glossary/settings.xml><?xml version="1.0" encoding="utf-8"?>
-<w:settings xmlns:mc="http://schemas.openxmlformats.org/markup-compatibility/2006" xmlns:o="urn:schemas-microsoft-com:office:office" xmlns:r="http://schemas.openxmlformats.org/officeDocument/2006/relationships" xmlns:m="http://schemas.openxmlformats.org/officeDocument/2006/math" xmlns:v="urn:schemas-microsoft-com:vml" xmlns:w10="urn:schemas-microsoft-com:office:word" xmlns:w="http://schemas.openxmlformats.org/wordprocessingml/2006/main" xmlns:w14="http://schemas.microsoft.com/office/word/2010/wordml" xmlns:w15="http://schemas.microsoft.com/office/word/2012/wordml" xmlns:w16cex="http://schemas.microsoft.com/office/word/2018/wordml/cex" xmlns:w16cid="http://schemas.microsoft.com/office/word/2016/wordml/cid" xmlns:w16="http://schemas.microsoft.com/office/word/2018/wordml" xmlns:w16sdtdh="http://schemas.microsoft.com/office/word/2020/wordml/sdtdatahash" xmlns:w16se="http://schemas.microsoft.com/office/word/2015/wordml/symex" xmlns:sl="http://schemas.openxmlformats.org/schemaLibrary/2006/main" mc:Ignorable="w14 w15 w16se w16cid w16 w16cex w16sdtdh">
+<w:settings xmlns:mc="http://schemas.openxmlformats.org/markup-compatibility/2006" xmlns:o="urn:schemas-microsoft-com:office:office" xmlns:r="http://schemas.openxmlformats.org/officeDocument/2006/relationships" xmlns:m="http://schemas.openxmlformats.org/officeDocument/2006/math" xmlns:v="urn:schemas-microsoft-com:vml" xmlns:w10="urn:schemas-microsoft-com:office:word" xmlns:w="http://schemas.openxmlformats.org/wordprocessingml/2006/main" xmlns:w14="http://schemas.microsoft.com/office/word/2010/wordml" xmlns:w15="http://schemas.microsoft.com/office/word/2012/wordml" xmlns:w16cex="http://schemas.microsoft.com/office/word/2018/wordml/cex" xmlns:w16cid="http://schemas.microsoft.com/office/word/2016/wordml/cid" xmlns:w16="http://schemas.microsoft.com/office/word/2018/wordml" xmlns:w16du="http://schemas.microsoft.com/office/word/2023/wordml/word16du" xmlns:w16sdtdh="http://schemas.microsoft.com/office/word/2020/wordml/sdtdatahash" xmlns:w16sdtfl="http://schemas.microsoft.com/office/word/2024/wordml/sdtformatlock" xmlns:w16se="http://schemas.microsoft.com/office/word/2015/wordml/symex" xmlns:sl="http://schemas.openxmlformats.org/schemaLibrary/2006/main" mc:Ignorable="w14 w15 w16se w16cid w16 w16cex w16sdtdh w16sdtfl w16du">
   <w:view w:val="normal"/>
   <w:defaultTabStop w:val="720"/>
   <w:characterSpacingControl w:val="doNotCompress"/>
@@ -6414,7 +6535,9 @@
     <w:rsid w:val="00560CB6"/>
     <w:rsid w:val="005F712F"/>
     <w:rsid w:val="006A264A"/>
+    <w:rsid w:val="0070099F"/>
     <w:rsid w:val="00720C08"/>
+    <w:rsid w:val="009021DC"/>
     <w:rsid w:val="009E646A"/>
     <w:rsid w:val="00A05D07"/>
     <w:rsid w:val="00A44EDC"/>
@@ -6424,6 +6547,7 @@
     <w:rsid w:val="00BB1E43"/>
     <w:rsid w:val="00BB2866"/>
     <w:rsid w:val="00BF58BB"/>
+    <w:rsid w:val="00C277EA"/>
     <w:rsid w:val="00C36457"/>
     <w:rsid w:val="00C42E36"/>
     <w:rsid w:val="00C64D42"/>
@@ -6454,7 +6578,7 @@
 </file>
 
 <file path=word/glossary/styles.xml><?xml version="1.0" encoding="utf-8"?>
-<w:styles xmlns:mc="http://schemas.openxmlformats.org/markup-compatibility/2006" xmlns:r="http://schemas.openxmlformats.org/officeDocument/2006/relationships" xmlns:w="http://schemas.openxmlformats.org/wordprocessingml/2006/main" xmlns:w14="http://schemas.microsoft.com/office/word/2010/wordml" xmlns:w15="http://schemas.microsoft.com/office/word/2012/wordml" xmlns:w16cex="http://schemas.microsoft.com/office/word/2018/wordml/cex" xmlns:w16cid="http://schemas.microsoft.com/office/word/2016/wordml/cid" xmlns:w16="http://schemas.microsoft.com/office/word/2018/wordml" xmlns:w16sdtdh="http://schemas.microsoft.com/office/word/2020/wordml/sdtdatahash" xmlns:w16se="http://schemas.microsoft.com/office/word/2015/wordml/symex" mc:Ignorable="w14 w15 w16se w16cid w16 w16cex w16sdtdh">
+<w:styles xmlns:mc="http://schemas.openxmlformats.org/markup-compatibility/2006" xmlns:r="http://schemas.openxmlformats.org/officeDocument/2006/relationships" xmlns:w="http://schemas.openxmlformats.org/wordprocessingml/2006/main" xmlns:w14="http://schemas.microsoft.com/office/word/2010/wordml" xmlns:w15="http://schemas.microsoft.com/office/word/2012/wordml" xmlns:w16cex="http://schemas.microsoft.com/office/word/2018/wordml/cex" xmlns:w16cid="http://schemas.microsoft.com/office/word/2016/wordml/cid" xmlns:w16="http://schemas.microsoft.com/office/word/2018/wordml" xmlns:w16du="http://schemas.microsoft.com/office/word/2023/wordml/word16du" xmlns:w16sdtdh="http://schemas.microsoft.com/office/word/2020/wordml/sdtdatahash" xmlns:w16sdtfl="http://schemas.microsoft.com/office/word/2024/wordml/sdtformatlock" xmlns:w16se="http://schemas.microsoft.com/office/word/2015/wordml/symex" mc:Ignorable="w14 w15 w16se w16cid w16 w16cex w16sdtdh w16sdtfl w16du">
   <w:docDefaults>
     <w:rPrDefault>
       <w:rPr>
@@ -6969,7 +7093,7 @@
 </file>
 
 <file path=word/glossary/webSettings.xml><?xml version="1.0" encoding="utf-8"?>
-<w:webSettings xmlns:mc="http://schemas.openxmlformats.org/markup-compatibility/2006" xmlns:r="http://schemas.openxmlformats.org/officeDocument/2006/relationships" xmlns:w="http://schemas.openxmlformats.org/wordprocessingml/2006/main" xmlns:w14="http://schemas.microsoft.com/office/word/2010/wordml" xmlns:w15="http://schemas.microsoft.com/office/word/2012/wordml" xmlns:w16cex="http://schemas.microsoft.com/office/word/2018/wordml/cex" xmlns:w16cid="http://schemas.microsoft.com/office/word/2016/wordml/cid" xmlns:w16="http://schemas.microsoft.com/office/word/2018/wordml" xmlns:w16sdtdh="http://schemas.microsoft.com/office/word/2020/wordml/sdtdatahash" xmlns:w16se="http://schemas.microsoft.com/office/word/2015/wordml/symex" mc:Ignorable="w14 w15 w16se w16cid w16 w16cex w16sdtdh">
+<w:webSettings xmlns:mc="http://schemas.openxmlformats.org/markup-compatibility/2006" xmlns:r="http://schemas.openxmlformats.org/officeDocument/2006/relationships" xmlns:w="http://schemas.openxmlformats.org/wordprocessingml/2006/main" xmlns:w14="http://schemas.microsoft.com/office/word/2010/wordml" xmlns:w15="http://schemas.microsoft.com/office/word/2012/wordml" xmlns:w16cex="http://schemas.microsoft.com/office/word/2018/wordml/cex" xmlns:w16cid="http://schemas.microsoft.com/office/word/2016/wordml/cid" xmlns:w16="http://schemas.microsoft.com/office/word/2018/wordml" xmlns:w16du="http://schemas.microsoft.com/office/word/2023/wordml/word16du" xmlns:w16sdtdh="http://schemas.microsoft.com/office/word/2020/wordml/sdtdatahash" xmlns:w16sdtfl="http://schemas.microsoft.com/office/word/2024/wordml/sdtformatlock" xmlns:w16se="http://schemas.microsoft.com/office/word/2015/wordml/symex" mc:Ignorable="w14 w15 w16se w16cid w16 w16cex w16sdtdh w16sdtfl w16du">
   <w:optimizeForBrowser/>
   <w:allowPNG/>
 </w:webSettings>

</xml_diff>